<commit_message>
docs(evals): per-subject (math vs geography) tables in both boards
Adds section 3b to the mt50 interim report and the sweep-3 detailed
report: per-model pass counts and rates split by subject, with a
math-minus-geography difference column. mt50 draws split 28 math /
22 geography; sweep-3 splits 104 / 96. Intro paragraphs state the
per-subject n and the noise threshold for reading the diff column.

Refs: offline_eval/multi_turn_results/oss13_multiturn_bottlenecks_2026-07-22.md
</commit_message>
<xml_diff>
--- a/offline_eval/multi_turn_results/MT50_BOARD_INTERIM_2026-07-26.docx
+++ b/offline_eval/multi_turn_results/MT50_BOARD_INTERIM_2026-07-26.docx
@@ -2624,6 +2624,1991 @@
         <w:t>Pending (results will be appended): qwen3-next-80b-thinking (running), glm-5, glm-4.7 (queued locally), grok-4.1-fast-reasoning/-non-reasoning, grok-4.20-reasoning/-non-reasoning, gemini-2.5-pro re-run (Colab), qwen3.6:35b-a3b (Colab OSS). Dropped by decision: qwen3-coder-480b, qwen3-235b-instruct.</w:t>
       </w:r>
     </w:p>
+    <w:p>
+      <w:pPr>
+        <w:pStyle w:val="Heading2"/>
+      </w:pPr>
+      <w:r>
+        <w:rPr>
+          <w:color w:val="0E7C6B"/>
+        </w:rPr>
+        <w:t>3b. Performance by subject — math vs geography</w:t>
+      </w:r>
+    </w:p>
+    <w:p>
+      <w:r>
+        <w:rPr>
+          <w:b w:val="0"/>
+          <w:i w:val="0"/>
+          <w:color w:val="55635F"/>
+          <w:sz w:val="19"/>
+        </w:rPr>
+        <w:t>The 50-scenario draw splits 28 math / 22 geography sessions (the two subjects in the Seychelles curriculum fixture). Math sessions exercise server-side numeric grading, working-request diagnosis and the complexity ladder; geography sessions are more recall- and reading-oriented. DIFF is math rate minus geography rate in percentage points. Per-subject n is small (28 / 22), so differences under ~15 points are within noise — read the column for direction, not precision.</w:t>
+      </w:r>
+    </w:p>
+    <w:tbl>
+      <w:tblPr>
+        <w:tblStyle w:val="LightGrid-Accent1"/>
+        <w:tblW w:type="auto" w:w="0"/>
+        <w:tblLook w:firstColumn="1" w:firstRow="1" w:lastColumn="0" w:lastRow="0" w:noHBand="0" w:noVBand="1" w:val="04A0"/>
+      </w:tblPr>
+      <w:tblGrid>
+        <w:gridCol w:w="1800"/>
+        <w:gridCol w:w="1800"/>
+        <w:gridCol w:w="1800"/>
+        <w:gridCol w:w="1800"/>
+        <w:gridCol w:w="1800"/>
+        <w:gridCol w:w="1800"/>
+        <w:gridCol w:w="1800"/>
+        <w:gridCol w:w="1800"/>
+      </w:tblGrid>
+      <w:tr>
+        <w:tc>
+          <w:tcPr>
+            <w:tcW w:type="dxa" w:w="504"/>
+          </w:tcPr>
+          <w:p>
+            <w:r/>
+            <w:r>
+              <w:rPr>
+                <w:b/>
+                <w:sz w:val="17"/>
+              </w:rPr>
+              <w:t>#</w:t>
+            </w:r>
+          </w:p>
+        </w:tc>
+        <w:tc>
+          <w:tcPr>
+            <w:tcW w:type="dxa" w:w="3312"/>
+          </w:tcPr>
+          <w:p>
+            <w:r/>
+            <w:r>
+              <w:rPr>
+                <w:b/>
+                <w:sz w:val="17"/>
+              </w:rPr>
+              <w:t>Model</w:t>
+            </w:r>
+          </w:p>
+        </w:tc>
+        <w:tc>
+          <w:tcPr>
+            <w:tcW w:type="dxa" w:w="720"/>
+          </w:tcPr>
+          <w:p>
+            <w:r/>
+            <w:r>
+              <w:rPr>
+                <w:b/>
+                <w:sz w:val="17"/>
+              </w:rPr>
+              <w:t>Tier</w:t>
+            </w:r>
+          </w:p>
+        </w:tc>
+        <w:tc>
+          <w:tcPr>
+            <w:tcW w:type="dxa" w:w="1368"/>
+          </w:tcPr>
+          <w:p>
+            <w:r/>
+            <w:r>
+              <w:rPr>
+                <w:b/>
+                <w:sz w:val="17"/>
+              </w:rPr>
+              <w:t>Math pass</w:t>
+            </w:r>
+          </w:p>
+        </w:tc>
+        <w:tc>
+          <w:tcPr>
+            <w:tcW w:type="dxa" w:w="1224"/>
+          </w:tcPr>
+          <w:p>
+            <w:r/>
+            <w:r>
+              <w:rPr>
+                <w:b/>
+                <w:sz w:val="17"/>
+              </w:rPr>
+              <w:t>Math rate</w:t>
+            </w:r>
+          </w:p>
+        </w:tc>
+        <w:tc>
+          <w:tcPr>
+            <w:tcW w:type="dxa" w:w="1368"/>
+          </w:tcPr>
+          <w:p>
+            <w:r/>
+            <w:r>
+              <w:rPr>
+                <w:b/>
+                <w:sz w:val="17"/>
+              </w:rPr>
+              <w:t>Geo pass</w:t>
+            </w:r>
+          </w:p>
+        </w:tc>
+        <w:tc>
+          <w:tcPr>
+            <w:tcW w:type="dxa" w:w="1224"/>
+          </w:tcPr>
+          <w:p>
+            <w:r/>
+            <w:r>
+              <w:rPr>
+                <w:b/>
+                <w:sz w:val="17"/>
+              </w:rPr>
+              <w:t>Geo rate</w:t>
+            </w:r>
+          </w:p>
+        </w:tc>
+        <w:tc>
+          <w:tcPr>
+            <w:tcW w:type="dxa" w:w="1368"/>
+          </w:tcPr>
+          <w:p>
+            <w:r/>
+            <w:r>
+              <w:rPr>
+                <w:b/>
+                <w:sz w:val="17"/>
+              </w:rPr>
+              <w:t>Diff (M−G)</w:t>
+            </w:r>
+          </w:p>
+        </w:tc>
+      </w:tr>
+      <w:tr>
+        <w:tc>
+          <w:tcPr>
+            <w:tcW w:type="dxa" w:w="504"/>
+          </w:tcPr>
+          <w:p>
+            <w:r/>
+            <w:r>
+              <w:rPr>
+                <w:sz w:val="17"/>
+              </w:rPr>
+              <w:t>1</w:t>
+            </w:r>
+          </w:p>
+        </w:tc>
+        <w:tc>
+          <w:tcPr>
+            <w:tcW w:type="dxa" w:w="3312"/>
+          </w:tcPr>
+          <w:p>
+            <w:r/>
+            <w:r>
+              <w:rPr>
+                <w:sz w:val="17"/>
+              </w:rPr>
+              <w:t>gemini-3.5-flash</w:t>
+            </w:r>
+          </w:p>
+        </w:tc>
+        <w:tc>
+          <w:tcPr>
+            <w:tcW w:type="dxa" w:w="720"/>
+          </w:tcPr>
+          <w:p>
+            <w:r/>
+            <w:r>
+              <w:rPr>
+                <w:sz w:val="17"/>
+              </w:rPr>
+              <w:t>API</w:t>
+            </w:r>
+          </w:p>
+        </w:tc>
+        <w:tc>
+          <w:tcPr>
+            <w:tcW w:type="dxa" w:w="1368"/>
+          </w:tcPr>
+          <w:p>
+            <w:r/>
+            <w:r>
+              <w:rPr>
+                <w:sz w:val="17"/>
+              </w:rPr>
+              <w:t>25/28</w:t>
+            </w:r>
+          </w:p>
+        </w:tc>
+        <w:tc>
+          <w:tcPr>
+            <w:tcW w:type="dxa" w:w="1224"/>
+          </w:tcPr>
+          <w:p>
+            <w:r/>
+            <w:r>
+              <w:rPr>
+                <w:sz w:val="17"/>
+              </w:rPr>
+              <w:t>89%</w:t>
+            </w:r>
+          </w:p>
+        </w:tc>
+        <w:tc>
+          <w:tcPr>
+            <w:tcW w:type="dxa" w:w="1368"/>
+          </w:tcPr>
+          <w:p>
+            <w:r/>
+            <w:r>
+              <w:rPr>
+                <w:sz w:val="17"/>
+              </w:rPr>
+              <w:t>22/22</w:t>
+            </w:r>
+          </w:p>
+        </w:tc>
+        <w:tc>
+          <w:tcPr>
+            <w:tcW w:type="dxa" w:w="1224"/>
+          </w:tcPr>
+          <w:p>
+            <w:r/>
+            <w:r>
+              <w:rPr>
+                <w:sz w:val="17"/>
+              </w:rPr>
+              <w:t>100%</w:t>
+            </w:r>
+          </w:p>
+        </w:tc>
+        <w:tc>
+          <w:tcPr>
+            <w:tcW w:type="dxa" w:w="1368"/>
+          </w:tcPr>
+          <w:p>
+            <w:r/>
+            <w:r>
+              <w:rPr>
+                <w:sz w:val="17"/>
+              </w:rPr>
+              <w:t>-11 pts</w:t>
+            </w:r>
+          </w:p>
+        </w:tc>
+      </w:tr>
+      <w:tr>
+        <w:tc>
+          <w:tcPr>
+            <w:tcW w:type="dxa" w:w="504"/>
+          </w:tcPr>
+          <w:p>
+            <w:r/>
+            <w:r>
+              <w:rPr>
+                <w:sz w:val="17"/>
+              </w:rPr>
+              <w:t>2</w:t>
+            </w:r>
+          </w:p>
+        </w:tc>
+        <w:tc>
+          <w:tcPr>
+            <w:tcW w:type="dxa" w:w="3312"/>
+          </w:tcPr>
+          <w:p>
+            <w:r/>
+            <w:r>
+              <w:rPr>
+                <w:sz w:val="17"/>
+              </w:rPr>
+              <w:t>claude-opus-4-7</w:t>
+            </w:r>
+          </w:p>
+        </w:tc>
+        <w:tc>
+          <w:tcPr>
+            <w:tcW w:type="dxa" w:w="720"/>
+          </w:tcPr>
+          <w:p>
+            <w:r/>
+            <w:r>
+              <w:rPr>
+                <w:sz w:val="17"/>
+              </w:rPr>
+              <w:t>API</w:t>
+            </w:r>
+          </w:p>
+        </w:tc>
+        <w:tc>
+          <w:tcPr>
+            <w:tcW w:type="dxa" w:w="1368"/>
+          </w:tcPr>
+          <w:p>
+            <w:r/>
+            <w:r>
+              <w:rPr>
+                <w:sz w:val="17"/>
+              </w:rPr>
+              <w:t>25/28</w:t>
+            </w:r>
+          </w:p>
+        </w:tc>
+        <w:tc>
+          <w:tcPr>
+            <w:tcW w:type="dxa" w:w="1224"/>
+          </w:tcPr>
+          <w:p>
+            <w:r/>
+            <w:r>
+              <w:rPr>
+                <w:sz w:val="17"/>
+              </w:rPr>
+              <w:t>89%</w:t>
+            </w:r>
+          </w:p>
+        </w:tc>
+        <w:tc>
+          <w:tcPr>
+            <w:tcW w:type="dxa" w:w="1368"/>
+          </w:tcPr>
+          <w:p>
+            <w:r/>
+            <w:r>
+              <w:rPr>
+                <w:sz w:val="17"/>
+              </w:rPr>
+              <w:t>21/22</w:t>
+            </w:r>
+          </w:p>
+        </w:tc>
+        <w:tc>
+          <w:tcPr>
+            <w:tcW w:type="dxa" w:w="1224"/>
+          </w:tcPr>
+          <w:p>
+            <w:r/>
+            <w:r>
+              <w:rPr>
+                <w:sz w:val="17"/>
+              </w:rPr>
+              <w:t>95%</w:t>
+            </w:r>
+          </w:p>
+        </w:tc>
+        <w:tc>
+          <w:tcPr>
+            <w:tcW w:type="dxa" w:w="1368"/>
+          </w:tcPr>
+          <w:p>
+            <w:r/>
+            <w:r>
+              <w:rPr>
+                <w:sz w:val="17"/>
+              </w:rPr>
+              <w:t>-6 pts</w:t>
+            </w:r>
+          </w:p>
+        </w:tc>
+      </w:tr>
+      <w:tr>
+        <w:tc>
+          <w:tcPr>
+            <w:tcW w:type="dxa" w:w="504"/>
+          </w:tcPr>
+          <w:p>
+            <w:r/>
+            <w:r>
+              <w:rPr>
+                <w:sz w:val="17"/>
+              </w:rPr>
+              <w:t>3</w:t>
+            </w:r>
+          </w:p>
+        </w:tc>
+        <w:tc>
+          <w:tcPr>
+            <w:tcW w:type="dxa" w:w="3312"/>
+          </w:tcPr>
+          <w:p>
+            <w:r/>
+            <w:r>
+              <w:rPr>
+                <w:sz w:val="17"/>
+              </w:rPr>
+              <w:t>claude-sonnet-4-6</w:t>
+            </w:r>
+          </w:p>
+        </w:tc>
+        <w:tc>
+          <w:tcPr>
+            <w:tcW w:type="dxa" w:w="720"/>
+          </w:tcPr>
+          <w:p>
+            <w:r/>
+            <w:r>
+              <w:rPr>
+                <w:sz w:val="17"/>
+              </w:rPr>
+              <w:t>API</w:t>
+            </w:r>
+          </w:p>
+        </w:tc>
+        <w:tc>
+          <w:tcPr>
+            <w:tcW w:type="dxa" w:w="1368"/>
+          </w:tcPr>
+          <w:p>
+            <w:r/>
+            <w:r>
+              <w:rPr>
+                <w:sz w:val="17"/>
+              </w:rPr>
+              <w:t>24/28</w:t>
+            </w:r>
+          </w:p>
+        </w:tc>
+        <w:tc>
+          <w:tcPr>
+            <w:tcW w:type="dxa" w:w="1224"/>
+          </w:tcPr>
+          <w:p>
+            <w:r/>
+            <w:r>
+              <w:rPr>
+                <w:sz w:val="17"/>
+              </w:rPr>
+              <w:t>86%</w:t>
+            </w:r>
+          </w:p>
+        </w:tc>
+        <w:tc>
+          <w:tcPr>
+            <w:tcW w:type="dxa" w:w="1368"/>
+          </w:tcPr>
+          <w:p>
+            <w:r/>
+            <w:r>
+              <w:rPr>
+                <w:sz w:val="17"/>
+              </w:rPr>
+              <w:t>22/22</w:t>
+            </w:r>
+          </w:p>
+        </w:tc>
+        <w:tc>
+          <w:tcPr>
+            <w:tcW w:type="dxa" w:w="1224"/>
+          </w:tcPr>
+          <w:p>
+            <w:r/>
+            <w:r>
+              <w:rPr>
+                <w:sz w:val="17"/>
+              </w:rPr>
+              <w:t>100%</w:t>
+            </w:r>
+          </w:p>
+        </w:tc>
+        <w:tc>
+          <w:tcPr>
+            <w:tcW w:type="dxa" w:w="1368"/>
+          </w:tcPr>
+          <w:p>
+            <w:r/>
+            <w:r>
+              <w:rPr>
+                <w:sz w:val="17"/>
+              </w:rPr>
+              <w:t>-14 pts</w:t>
+            </w:r>
+          </w:p>
+        </w:tc>
+      </w:tr>
+      <w:tr>
+        <w:tc>
+          <w:tcPr>
+            <w:tcW w:type="dxa" w:w="504"/>
+          </w:tcPr>
+          <w:p>
+            <w:r/>
+            <w:r>
+              <w:rPr>
+                <w:sz w:val="17"/>
+              </w:rPr>
+              <w:t>4</w:t>
+            </w:r>
+          </w:p>
+        </w:tc>
+        <w:tc>
+          <w:tcPr>
+            <w:tcW w:type="dxa" w:w="3312"/>
+          </w:tcPr>
+          <w:p>
+            <w:r/>
+            <w:r>
+              <w:rPr>
+                <w:sz w:val="17"/>
+              </w:rPr>
+              <w:t>gemini-3.1-pro</w:t>
+            </w:r>
+          </w:p>
+        </w:tc>
+        <w:tc>
+          <w:tcPr>
+            <w:tcW w:type="dxa" w:w="720"/>
+          </w:tcPr>
+          <w:p>
+            <w:r/>
+            <w:r>
+              <w:rPr>
+                <w:sz w:val="17"/>
+              </w:rPr>
+              <w:t>API</w:t>
+            </w:r>
+          </w:p>
+        </w:tc>
+        <w:tc>
+          <w:tcPr>
+            <w:tcW w:type="dxa" w:w="1368"/>
+          </w:tcPr>
+          <w:p>
+            <w:r/>
+            <w:r>
+              <w:rPr>
+                <w:sz w:val="17"/>
+              </w:rPr>
+              <w:t>24/28</w:t>
+            </w:r>
+          </w:p>
+        </w:tc>
+        <w:tc>
+          <w:tcPr>
+            <w:tcW w:type="dxa" w:w="1224"/>
+          </w:tcPr>
+          <w:p>
+            <w:r/>
+            <w:r>
+              <w:rPr>
+                <w:sz w:val="17"/>
+              </w:rPr>
+              <w:t>86%</w:t>
+            </w:r>
+          </w:p>
+        </w:tc>
+        <w:tc>
+          <w:tcPr>
+            <w:tcW w:type="dxa" w:w="1368"/>
+          </w:tcPr>
+          <w:p>
+            <w:r/>
+            <w:r>
+              <w:rPr>
+                <w:sz w:val="17"/>
+              </w:rPr>
+              <w:t>22/22</w:t>
+            </w:r>
+          </w:p>
+        </w:tc>
+        <w:tc>
+          <w:tcPr>
+            <w:tcW w:type="dxa" w:w="1224"/>
+          </w:tcPr>
+          <w:p>
+            <w:r/>
+            <w:r>
+              <w:rPr>
+                <w:sz w:val="17"/>
+              </w:rPr>
+              <w:t>100%</w:t>
+            </w:r>
+          </w:p>
+        </w:tc>
+        <w:tc>
+          <w:tcPr>
+            <w:tcW w:type="dxa" w:w="1368"/>
+          </w:tcPr>
+          <w:p>
+            <w:r/>
+            <w:r>
+              <w:rPr>
+                <w:sz w:val="17"/>
+              </w:rPr>
+              <w:t>-14 pts</w:t>
+            </w:r>
+          </w:p>
+        </w:tc>
+      </w:tr>
+      <w:tr>
+        <w:tc>
+          <w:tcPr>
+            <w:tcW w:type="dxa" w:w="504"/>
+          </w:tcPr>
+          <w:p>
+            <w:r/>
+            <w:r>
+              <w:rPr>
+                <w:sz w:val="17"/>
+              </w:rPr>
+              <w:t>5</w:t>
+            </w:r>
+          </w:p>
+        </w:tc>
+        <w:tc>
+          <w:tcPr>
+            <w:tcW w:type="dxa" w:w="3312"/>
+          </w:tcPr>
+          <w:p>
+            <w:r/>
+            <w:r>
+              <w:rPr>
+                <w:sz w:val="17"/>
+              </w:rPr>
+              <w:t>gemini-2.5-flash</w:t>
+            </w:r>
+          </w:p>
+        </w:tc>
+        <w:tc>
+          <w:tcPr>
+            <w:tcW w:type="dxa" w:w="720"/>
+          </w:tcPr>
+          <w:p>
+            <w:r/>
+            <w:r>
+              <w:rPr>
+                <w:sz w:val="17"/>
+              </w:rPr>
+              <w:t>API</w:t>
+            </w:r>
+          </w:p>
+        </w:tc>
+        <w:tc>
+          <w:tcPr>
+            <w:tcW w:type="dxa" w:w="1368"/>
+          </w:tcPr>
+          <w:p>
+            <w:r/>
+            <w:r>
+              <w:rPr>
+                <w:sz w:val="17"/>
+              </w:rPr>
+              <w:t>22/28</w:t>
+            </w:r>
+          </w:p>
+        </w:tc>
+        <w:tc>
+          <w:tcPr>
+            <w:tcW w:type="dxa" w:w="1224"/>
+          </w:tcPr>
+          <w:p>
+            <w:r/>
+            <w:r>
+              <w:rPr>
+                <w:sz w:val="17"/>
+              </w:rPr>
+              <w:t>79%</w:t>
+            </w:r>
+          </w:p>
+        </w:tc>
+        <w:tc>
+          <w:tcPr>
+            <w:tcW w:type="dxa" w:w="1368"/>
+          </w:tcPr>
+          <w:p>
+            <w:r/>
+            <w:r>
+              <w:rPr>
+                <w:sz w:val="17"/>
+              </w:rPr>
+              <w:t>22/22</w:t>
+            </w:r>
+          </w:p>
+        </w:tc>
+        <w:tc>
+          <w:tcPr>
+            <w:tcW w:type="dxa" w:w="1224"/>
+          </w:tcPr>
+          <w:p>
+            <w:r/>
+            <w:r>
+              <w:rPr>
+                <w:sz w:val="17"/>
+              </w:rPr>
+              <w:t>100%</w:t>
+            </w:r>
+          </w:p>
+        </w:tc>
+        <w:tc>
+          <w:tcPr>
+            <w:tcW w:type="dxa" w:w="1368"/>
+          </w:tcPr>
+          <w:p>
+            <w:r/>
+            <w:r>
+              <w:rPr>
+                <w:sz w:val="17"/>
+              </w:rPr>
+              <w:t>-21 pts</w:t>
+            </w:r>
+          </w:p>
+        </w:tc>
+      </w:tr>
+      <w:tr>
+        <w:tc>
+          <w:tcPr>
+            <w:tcW w:type="dxa" w:w="504"/>
+          </w:tcPr>
+          <w:p>
+            <w:r/>
+            <w:r>
+              <w:rPr>
+                <w:sz w:val="17"/>
+              </w:rPr>
+              <w:t>6</w:t>
+            </w:r>
+          </w:p>
+        </w:tc>
+        <w:tc>
+          <w:tcPr>
+            <w:tcW w:type="dxa" w:w="3312"/>
+          </w:tcPr>
+          <w:p>
+            <w:r/>
+            <w:r>
+              <w:rPr>
+                <w:sz w:val="17"/>
+              </w:rPr>
+              <w:t>qwen3_4b</w:t>
+            </w:r>
+          </w:p>
+        </w:tc>
+        <w:tc>
+          <w:tcPr>
+            <w:tcW w:type="dxa" w:w="720"/>
+          </w:tcPr>
+          <w:p>
+            <w:r/>
+            <w:r>
+              <w:rPr>
+                <w:sz w:val="17"/>
+              </w:rPr>
+              <w:t>OSS</w:t>
+            </w:r>
+          </w:p>
+        </w:tc>
+        <w:tc>
+          <w:tcPr>
+            <w:tcW w:type="dxa" w:w="1368"/>
+          </w:tcPr>
+          <w:p>
+            <w:r/>
+            <w:r>
+              <w:rPr>
+                <w:sz w:val="17"/>
+              </w:rPr>
+              <w:t>22/28</w:t>
+            </w:r>
+          </w:p>
+        </w:tc>
+        <w:tc>
+          <w:tcPr>
+            <w:tcW w:type="dxa" w:w="1224"/>
+          </w:tcPr>
+          <w:p>
+            <w:r/>
+            <w:r>
+              <w:rPr>
+                <w:sz w:val="17"/>
+              </w:rPr>
+              <w:t>79%</w:t>
+            </w:r>
+          </w:p>
+        </w:tc>
+        <w:tc>
+          <w:tcPr>
+            <w:tcW w:type="dxa" w:w="1368"/>
+          </w:tcPr>
+          <w:p>
+            <w:r/>
+            <w:r>
+              <w:rPr>
+                <w:sz w:val="17"/>
+              </w:rPr>
+              <w:t>22/22</w:t>
+            </w:r>
+          </w:p>
+        </w:tc>
+        <w:tc>
+          <w:tcPr>
+            <w:tcW w:type="dxa" w:w="1224"/>
+          </w:tcPr>
+          <w:p>
+            <w:r/>
+            <w:r>
+              <w:rPr>
+                <w:sz w:val="17"/>
+              </w:rPr>
+              <w:t>100%</w:t>
+            </w:r>
+          </w:p>
+        </w:tc>
+        <w:tc>
+          <w:tcPr>
+            <w:tcW w:type="dxa" w:w="1368"/>
+          </w:tcPr>
+          <w:p>
+            <w:r/>
+            <w:r>
+              <w:rPr>
+                <w:sz w:val="17"/>
+              </w:rPr>
+              <w:t>-21 pts</w:t>
+            </w:r>
+          </w:p>
+        </w:tc>
+      </w:tr>
+      <w:tr>
+        <w:tc>
+          <w:tcPr>
+            <w:tcW w:type="dxa" w:w="504"/>
+          </w:tcPr>
+          <w:p>
+            <w:r/>
+            <w:r>
+              <w:rPr>
+                <w:sz w:val="17"/>
+              </w:rPr>
+              <w:t>7</w:t>
+            </w:r>
+          </w:p>
+        </w:tc>
+        <w:tc>
+          <w:tcPr>
+            <w:tcW w:type="dxa" w:w="3312"/>
+          </w:tcPr>
+          <w:p>
+            <w:r/>
+            <w:r>
+              <w:rPr>
+                <w:sz w:val="17"/>
+              </w:rPr>
+              <w:t>deepseek-v3.1</w:t>
+            </w:r>
+          </w:p>
+        </w:tc>
+        <w:tc>
+          <w:tcPr>
+            <w:tcW w:type="dxa" w:w="720"/>
+          </w:tcPr>
+          <w:p>
+            <w:r/>
+            <w:r>
+              <w:rPr>
+                <w:sz w:val="17"/>
+              </w:rPr>
+              <w:t>API</w:t>
+            </w:r>
+          </w:p>
+        </w:tc>
+        <w:tc>
+          <w:tcPr>
+            <w:tcW w:type="dxa" w:w="1368"/>
+          </w:tcPr>
+          <w:p>
+            <w:r/>
+            <w:r>
+              <w:rPr>
+                <w:sz w:val="17"/>
+              </w:rPr>
+              <w:t>23/28</w:t>
+            </w:r>
+          </w:p>
+        </w:tc>
+        <w:tc>
+          <w:tcPr>
+            <w:tcW w:type="dxa" w:w="1224"/>
+          </w:tcPr>
+          <w:p>
+            <w:r/>
+            <w:r>
+              <w:rPr>
+                <w:sz w:val="17"/>
+              </w:rPr>
+              <w:t>82%</w:t>
+            </w:r>
+          </w:p>
+        </w:tc>
+        <w:tc>
+          <w:tcPr>
+            <w:tcW w:type="dxa" w:w="1368"/>
+          </w:tcPr>
+          <w:p>
+            <w:r/>
+            <w:r>
+              <w:rPr>
+                <w:sz w:val="17"/>
+              </w:rPr>
+              <w:t>20/22</w:t>
+            </w:r>
+          </w:p>
+        </w:tc>
+        <w:tc>
+          <w:tcPr>
+            <w:tcW w:type="dxa" w:w="1224"/>
+          </w:tcPr>
+          <w:p>
+            <w:r/>
+            <w:r>
+              <w:rPr>
+                <w:sz w:val="17"/>
+              </w:rPr>
+              <w:t>91%</w:t>
+            </w:r>
+          </w:p>
+        </w:tc>
+        <w:tc>
+          <w:tcPr>
+            <w:tcW w:type="dxa" w:w="1368"/>
+          </w:tcPr>
+          <w:p>
+            <w:r/>
+            <w:r>
+              <w:rPr>
+                <w:sz w:val="17"/>
+              </w:rPr>
+              <w:t>-9 pts</w:t>
+            </w:r>
+          </w:p>
+        </w:tc>
+      </w:tr>
+      <w:tr>
+        <w:tc>
+          <w:tcPr>
+            <w:tcW w:type="dxa" w:w="504"/>
+          </w:tcPr>
+          <w:p>
+            <w:r/>
+            <w:r>
+              <w:rPr>
+                <w:sz w:val="17"/>
+              </w:rPr>
+              <w:t>8</w:t>
+            </w:r>
+          </w:p>
+        </w:tc>
+        <w:tc>
+          <w:tcPr>
+            <w:tcW w:type="dxa" w:w="3312"/>
+          </w:tcPr>
+          <w:p>
+            <w:r/>
+            <w:r>
+              <w:rPr>
+                <w:sz w:val="17"/>
+              </w:rPr>
+              <w:t>kimi-k2-thinking</w:t>
+            </w:r>
+          </w:p>
+        </w:tc>
+        <w:tc>
+          <w:tcPr>
+            <w:tcW w:type="dxa" w:w="720"/>
+          </w:tcPr>
+          <w:p>
+            <w:r/>
+            <w:r>
+              <w:rPr>
+                <w:sz w:val="17"/>
+              </w:rPr>
+              <w:t>API</w:t>
+            </w:r>
+          </w:p>
+        </w:tc>
+        <w:tc>
+          <w:tcPr>
+            <w:tcW w:type="dxa" w:w="1368"/>
+          </w:tcPr>
+          <w:p>
+            <w:r/>
+            <w:r>
+              <w:rPr>
+                <w:sz w:val="17"/>
+              </w:rPr>
+              <w:t>21/28</w:t>
+            </w:r>
+          </w:p>
+        </w:tc>
+        <w:tc>
+          <w:tcPr>
+            <w:tcW w:type="dxa" w:w="1224"/>
+          </w:tcPr>
+          <w:p>
+            <w:r/>
+            <w:r>
+              <w:rPr>
+                <w:sz w:val="17"/>
+              </w:rPr>
+              <w:t>75%</w:t>
+            </w:r>
+          </w:p>
+        </w:tc>
+        <w:tc>
+          <w:tcPr>
+            <w:tcW w:type="dxa" w:w="1368"/>
+          </w:tcPr>
+          <w:p>
+            <w:r/>
+            <w:r>
+              <w:rPr>
+                <w:sz w:val="17"/>
+              </w:rPr>
+              <w:t>22/22</w:t>
+            </w:r>
+          </w:p>
+        </w:tc>
+        <w:tc>
+          <w:tcPr>
+            <w:tcW w:type="dxa" w:w="1224"/>
+          </w:tcPr>
+          <w:p>
+            <w:r/>
+            <w:r>
+              <w:rPr>
+                <w:sz w:val="17"/>
+              </w:rPr>
+              <w:t>100%</w:t>
+            </w:r>
+          </w:p>
+        </w:tc>
+        <w:tc>
+          <w:tcPr>
+            <w:tcW w:type="dxa" w:w="1368"/>
+          </w:tcPr>
+          <w:p>
+            <w:r/>
+            <w:r>
+              <w:rPr>
+                <w:sz w:val="17"/>
+              </w:rPr>
+              <w:t>-25 pts</w:t>
+            </w:r>
+          </w:p>
+        </w:tc>
+      </w:tr>
+      <w:tr>
+        <w:tc>
+          <w:tcPr>
+            <w:tcW w:type="dxa" w:w="504"/>
+          </w:tcPr>
+          <w:p>
+            <w:r/>
+            <w:r>
+              <w:rPr>
+                <w:sz w:val="17"/>
+              </w:rPr>
+              <w:t>9</w:t>
+            </w:r>
+          </w:p>
+        </w:tc>
+        <w:tc>
+          <w:tcPr>
+            <w:tcW w:type="dxa" w:w="3312"/>
+          </w:tcPr>
+          <w:p>
+            <w:r/>
+            <w:r>
+              <w:rPr>
+                <w:sz w:val="17"/>
+              </w:rPr>
+              <w:t>deepseek-v3.2</w:t>
+            </w:r>
+          </w:p>
+        </w:tc>
+        <w:tc>
+          <w:tcPr>
+            <w:tcW w:type="dxa" w:w="720"/>
+          </w:tcPr>
+          <w:p>
+            <w:r/>
+            <w:r>
+              <w:rPr>
+                <w:sz w:val="17"/>
+              </w:rPr>
+              <w:t>API</w:t>
+            </w:r>
+          </w:p>
+        </w:tc>
+        <w:tc>
+          <w:tcPr>
+            <w:tcW w:type="dxa" w:w="1368"/>
+          </w:tcPr>
+          <w:p>
+            <w:r/>
+            <w:r>
+              <w:rPr>
+                <w:sz w:val="17"/>
+              </w:rPr>
+              <w:t>21/28</w:t>
+            </w:r>
+          </w:p>
+        </w:tc>
+        <w:tc>
+          <w:tcPr>
+            <w:tcW w:type="dxa" w:w="1224"/>
+          </w:tcPr>
+          <w:p>
+            <w:r/>
+            <w:r>
+              <w:rPr>
+                <w:sz w:val="17"/>
+              </w:rPr>
+              <w:t>75%</w:t>
+            </w:r>
+          </w:p>
+        </w:tc>
+        <w:tc>
+          <w:tcPr>
+            <w:tcW w:type="dxa" w:w="1368"/>
+          </w:tcPr>
+          <w:p>
+            <w:r/>
+            <w:r>
+              <w:rPr>
+                <w:sz w:val="17"/>
+              </w:rPr>
+              <w:t>21/22</w:t>
+            </w:r>
+          </w:p>
+        </w:tc>
+        <w:tc>
+          <w:tcPr>
+            <w:tcW w:type="dxa" w:w="1224"/>
+          </w:tcPr>
+          <w:p>
+            <w:r/>
+            <w:r>
+              <w:rPr>
+                <w:sz w:val="17"/>
+              </w:rPr>
+              <w:t>95%</w:t>
+            </w:r>
+          </w:p>
+        </w:tc>
+        <w:tc>
+          <w:tcPr>
+            <w:tcW w:type="dxa" w:w="1368"/>
+          </w:tcPr>
+          <w:p>
+            <w:r/>
+            <w:r>
+              <w:rPr>
+                <w:sz w:val="17"/>
+              </w:rPr>
+              <w:t>-20 pts</w:t>
+            </w:r>
+          </w:p>
+        </w:tc>
+      </w:tr>
+      <w:tr>
+        <w:tc>
+          <w:tcPr>
+            <w:tcW w:type="dxa" w:w="504"/>
+          </w:tcPr>
+          <w:p>
+            <w:r/>
+            <w:r>
+              <w:rPr>
+                <w:sz w:val="17"/>
+              </w:rPr>
+              <w:t>10</w:t>
+            </w:r>
+          </w:p>
+        </w:tc>
+        <w:tc>
+          <w:tcPr>
+            <w:tcW w:type="dxa" w:w="3312"/>
+          </w:tcPr>
+          <w:p>
+            <w:r/>
+            <w:r>
+              <w:rPr>
+                <w:sz w:val="17"/>
+              </w:rPr>
+              <w:t>qwen3_30b-a3b</w:t>
+            </w:r>
+          </w:p>
+        </w:tc>
+        <w:tc>
+          <w:tcPr>
+            <w:tcW w:type="dxa" w:w="720"/>
+          </w:tcPr>
+          <w:p>
+            <w:r/>
+            <w:r>
+              <w:rPr>
+                <w:sz w:val="17"/>
+              </w:rPr>
+              <w:t>OSS</w:t>
+            </w:r>
+          </w:p>
+        </w:tc>
+        <w:tc>
+          <w:tcPr>
+            <w:tcW w:type="dxa" w:w="1368"/>
+          </w:tcPr>
+          <w:p>
+            <w:r/>
+            <w:r>
+              <w:rPr>
+                <w:sz w:val="17"/>
+              </w:rPr>
+              <w:t>21/28</w:t>
+            </w:r>
+          </w:p>
+        </w:tc>
+        <w:tc>
+          <w:tcPr>
+            <w:tcW w:type="dxa" w:w="1224"/>
+          </w:tcPr>
+          <w:p>
+            <w:r/>
+            <w:r>
+              <w:rPr>
+                <w:sz w:val="17"/>
+              </w:rPr>
+              <w:t>75%</w:t>
+            </w:r>
+          </w:p>
+        </w:tc>
+        <w:tc>
+          <w:tcPr>
+            <w:tcW w:type="dxa" w:w="1368"/>
+          </w:tcPr>
+          <w:p>
+            <w:r/>
+            <w:r>
+              <w:rPr>
+                <w:sz w:val="17"/>
+              </w:rPr>
+              <w:t>21/22</w:t>
+            </w:r>
+          </w:p>
+        </w:tc>
+        <w:tc>
+          <w:tcPr>
+            <w:tcW w:type="dxa" w:w="1224"/>
+          </w:tcPr>
+          <w:p>
+            <w:r/>
+            <w:r>
+              <w:rPr>
+                <w:sz w:val="17"/>
+              </w:rPr>
+              <w:t>95%</w:t>
+            </w:r>
+          </w:p>
+        </w:tc>
+        <w:tc>
+          <w:tcPr>
+            <w:tcW w:type="dxa" w:w="1368"/>
+          </w:tcPr>
+          <w:p>
+            <w:r/>
+            <w:r>
+              <w:rPr>
+                <w:sz w:val="17"/>
+              </w:rPr>
+              <w:t>-20 pts</w:t>
+            </w:r>
+          </w:p>
+        </w:tc>
+      </w:tr>
+      <w:tr>
+        <w:tc>
+          <w:tcPr>
+            <w:tcW w:type="dxa" w:w="504"/>
+          </w:tcPr>
+          <w:p>
+            <w:r/>
+            <w:r>
+              <w:rPr>
+                <w:sz w:val="17"/>
+              </w:rPr>
+              <w:t>11</w:t>
+            </w:r>
+          </w:p>
+        </w:tc>
+        <w:tc>
+          <w:tcPr>
+            <w:tcW w:type="dxa" w:w="3312"/>
+          </w:tcPr>
+          <w:p>
+            <w:r/>
+            <w:r>
+              <w:rPr>
+                <w:sz w:val="17"/>
+              </w:rPr>
+              <w:t>qwen3-next-80b-instruct</w:t>
+            </w:r>
+          </w:p>
+        </w:tc>
+        <w:tc>
+          <w:tcPr>
+            <w:tcW w:type="dxa" w:w="720"/>
+          </w:tcPr>
+          <w:p>
+            <w:r/>
+            <w:r>
+              <w:rPr>
+                <w:sz w:val="17"/>
+              </w:rPr>
+              <w:t>API</w:t>
+            </w:r>
+          </w:p>
+        </w:tc>
+        <w:tc>
+          <w:tcPr>
+            <w:tcW w:type="dxa" w:w="1368"/>
+          </w:tcPr>
+          <w:p>
+            <w:r/>
+            <w:r>
+              <w:rPr>
+                <w:sz w:val="17"/>
+              </w:rPr>
+              <w:t>19/28</w:t>
+            </w:r>
+          </w:p>
+        </w:tc>
+        <w:tc>
+          <w:tcPr>
+            <w:tcW w:type="dxa" w:w="1224"/>
+          </w:tcPr>
+          <w:p>
+            <w:r/>
+            <w:r>
+              <w:rPr>
+                <w:sz w:val="17"/>
+              </w:rPr>
+              <w:t>68%</w:t>
+            </w:r>
+          </w:p>
+        </w:tc>
+        <w:tc>
+          <w:tcPr>
+            <w:tcW w:type="dxa" w:w="1368"/>
+          </w:tcPr>
+          <w:p>
+            <w:r/>
+            <w:r>
+              <w:rPr>
+                <w:sz w:val="17"/>
+              </w:rPr>
+              <w:t>22/22</w:t>
+            </w:r>
+          </w:p>
+        </w:tc>
+        <w:tc>
+          <w:tcPr>
+            <w:tcW w:type="dxa" w:w="1224"/>
+          </w:tcPr>
+          <w:p>
+            <w:r/>
+            <w:r>
+              <w:rPr>
+                <w:sz w:val="17"/>
+              </w:rPr>
+              <w:t>100%</w:t>
+            </w:r>
+          </w:p>
+        </w:tc>
+        <w:tc>
+          <w:tcPr>
+            <w:tcW w:type="dxa" w:w="1368"/>
+          </w:tcPr>
+          <w:p>
+            <w:r/>
+            <w:r>
+              <w:rPr>
+                <w:sz w:val="17"/>
+              </w:rPr>
+              <w:t>-32 pts</w:t>
+            </w:r>
+          </w:p>
+        </w:tc>
+      </w:tr>
+      <w:tr>
+        <w:tc>
+          <w:tcPr>
+            <w:tcW w:type="dxa" w:w="504"/>
+          </w:tcPr>
+          <w:p>
+            <w:r/>
+            <w:r>
+              <w:rPr>
+                <w:sz w:val="17"/>
+              </w:rPr>
+              <w:t>12</w:t>
+            </w:r>
+          </w:p>
+        </w:tc>
+        <w:tc>
+          <w:tcPr>
+            <w:tcW w:type="dxa" w:w="3312"/>
+          </w:tcPr>
+          <w:p>
+            <w:r/>
+            <w:r>
+              <w:rPr>
+                <w:sz w:val="17"/>
+              </w:rPr>
+              <w:t>claude-haiku-4-5</w:t>
+            </w:r>
+          </w:p>
+        </w:tc>
+        <w:tc>
+          <w:tcPr>
+            <w:tcW w:type="dxa" w:w="720"/>
+          </w:tcPr>
+          <w:p>
+            <w:r/>
+            <w:r>
+              <w:rPr>
+                <w:sz w:val="17"/>
+              </w:rPr>
+              <w:t>API</w:t>
+            </w:r>
+          </w:p>
+        </w:tc>
+        <w:tc>
+          <w:tcPr>
+            <w:tcW w:type="dxa" w:w="1368"/>
+          </w:tcPr>
+          <w:p>
+            <w:r/>
+            <w:r>
+              <w:rPr>
+                <w:sz w:val="17"/>
+              </w:rPr>
+              <w:t>18/28</w:t>
+            </w:r>
+          </w:p>
+        </w:tc>
+        <w:tc>
+          <w:tcPr>
+            <w:tcW w:type="dxa" w:w="1224"/>
+          </w:tcPr>
+          <w:p>
+            <w:r/>
+            <w:r>
+              <w:rPr>
+                <w:sz w:val="17"/>
+              </w:rPr>
+              <w:t>64%</w:t>
+            </w:r>
+          </w:p>
+        </w:tc>
+        <w:tc>
+          <w:tcPr>
+            <w:tcW w:type="dxa" w:w="1368"/>
+          </w:tcPr>
+          <w:p>
+            <w:r/>
+            <w:r>
+              <w:rPr>
+                <w:sz w:val="17"/>
+              </w:rPr>
+              <w:t>21/22</w:t>
+            </w:r>
+          </w:p>
+        </w:tc>
+        <w:tc>
+          <w:tcPr>
+            <w:tcW w:type="dxa" w:w="1224"/>
+          </w:tcPr>
+          <w:p>
+            <w:r/>
+            <w:r>
+              <w:rPr>
+                <w:sz w:val="17"/>
+              </w:rPr>
+              <w:t>95%</w:t>
+            </w:r>
+          </w:p>
+        </w:tc>
+        <w:tc>
+          <w:tcPr>
+            <w:tcW w:type="dxa" w:w="1368"/>
+          </w:tcPr>
+          <w:p>
+            <w:r/>
+            <w:r>
+              <w:rPr>
+                <w:sz w:val="17"/>
+              </w:rPr>
+              <w:t>-31 pts</w:t>
+            </w:r>
+          </w:p>
+        </w:tc>
+      </w:tr>
+      <w:tr>
+        <w:tc>
+          <w:tcPr>
+            <w:tcW w:type="dxa" w:w="504"/>
+          </w:tcPr>
+          <w:p>
+            <w:r/>
+            <w:r>
+              <w:rPr>
+                <w:sz w:val="17"/>
+              </w:rPr>
+              <w:t>13</w:t>
+            </w:r>
+          </w:p>
+        </w:tc>
+        <w:tc>
+          <w:tcPr>
+            <w:tcW w:type="dxa" w:w="3312"/>
+          </w:tcPr>
+          <w:p>
+            <w:r/>
+            <w:r>
+              <w:rPr>
+                <w:sz w:val="17"/>
+              </w:rPr>
+              <w:t>qwen3_14b</w:t>
+            </w:r>
+          </w:p>
+        </w:tc>
+        <w:tc>
+          <w:tcPr>
+            <w:tcW w:type="dxa" w:w="720"/>
+          </w:tcPr>
+          <w:p>
+            <w:r/>
+            <w:r>
+              <w:rPr>
+                <w:sz w:val="17"/>
+              </w:rPr>
+              <w:t>OSS</w:t>
+            </w:r>
+          </w:p>
+        </w:tc>
+        <w:tc>
+          <w:tcPr>
+            <w:tcW w:type="dxa" w:w="1368"/>
+          </w:tcPr>
+          <w:p>
+            <w:r/>
+            <w:r>
+              <w:rPr>
+                <w:sz w:val="17"/>
+              </w:rPr>
+              <w:t>17/28</w:t>
+            </w:r>
+          </w:p>
+        </w:tc>
+        <w:tc>
+          <w:tcPr>
+            <w:tcW w:type="dxa" w:w="1224"/>
+          </w:tcPr>
+          <w:p>
+            <w:r/>
+            <w:r>
+              <w:rPr>
+                <w:sz w:val="17"/>
+              </w:rPr>
+              <w:t>61%</w:t>
+            </w:r>
+          </w:p>
+        </w:tc>
+        <w:tc>
+          <w:tcPr>
+            <w:tcW w:type="dxa" w:w="1368"/>
+          </w:tcPr>
+          <w:p>
+            <w:r/>
+            <w:r>
+              <w:rPr>
+                <w:sz w:val="17"/>
+              </w:rPr>
+              <w:t>20/22</w:t>
+            </w:r>
+          </w:p>
+        </w:tc>
+        <w:tc>
+          <w:tcPr>
+            <w:tcW w:type="dxa" w:w="1224"/>
+          </w:tcPr>
+          <w:p>
+            <w:r/>
+            <w:r>
+              <w:rPr>
+                <w:sz w:val="17"/>
+              </w:rPr>
+              <w:t>91%</w:t>
+            </w:r>
+          </w:p>
+        </w:tc>
+        <w:tc>
+          <w:tcPr>
+            <w:tcW w:type="dxa" w:w="1368"/>
+          </w:tcPr>
+          <w:p>
+            <w:r/>
+            <w:r>
+              <w:rPr>
+                <w:sz w:val="17"/>
+              </w:rPr>
+              <w:t>-30 pts</w:t>
+            </w:r>
+          </w:p>
+        </w:tc>
+      </w:tr>
+      <w:tr>
+        <w:tc>
+          <w:tcPr>
+            <w:tcW w:type="dxa" w:w="504"/>
+          </w:tcPr>
+          <w:p>
+            <w:r/>
+            <w:r>
+              <w:rPr>
+                <w:sz w:val="17"/>
+              </w:rPr>
+              <w:t>14</w:t>
+            </w:r>
+          </w:p>
+        </w:tc>
+        <w:tc>
+          <w:tcPr>
+            <w:tcW w:type="dxa" w:w="3312"/>
+          </w:tcPr>
+          <w:p>
+            <w:r/>
+            <w:r>
+              <w:rPr>
+                <w:sz w:val="17"/>
+              </w:rPr>
+              <w:t>qwen3.5_9b</w:t>
+            </w:r>
+          </w:p>
+        </w:tc>
+        <w:tc>
+          <w:tcPr>
+            <w:tcW w:type="dxa" w:w="720"/>
+          </w:tcPr>
+          <w:p>
+            <w:r/>
+            <w:r>
+              <w:rPr>
+                <w:sz w:val="17"/>
+              </w:rPr>
+              <w:t>OSS</w:t>
+            </w:r>
+          </w:p>
+        </w:tc>
+        <w:tc>
+          <w:tcPr>
+            <w:tcW w:type="dxa" w:w="1368"/>
+          </w:tcPr>
+          <w:p>
+            <w:r/>
+            <w:r>
+              <w:rPr>
+                <w:sz w:val="17"/>
+              </w:rPr>
+              <w:t>11/28</w:t>
+            </w:r>
+          </w:p>
+        </w:tc>
+        <w:tc>
+          <w:tcPr>
+            <w:tcW w:type="dxa" w:w="1224"/>
+          </w:tcPr>
+          <w:p>
+            <w:r/>
+            <w:r>
+              <w:rPr>
+                <w:sz w:val="17"/>
+              </w:rPr>
+              <w:t>39%</w:t>
+            </w:r>
+          </w:p>
+        </w:tc>
+        <w:tc>
+          <w:tcPr>
+            <w:tcW w:type="dxa" w:w="1368"/>
+          </w:tcPr>
+          <w:p>
+            <w:r/>
+            <w:r>
+              <w:rPr>
+                <w:sz w:val="17"/>
+              </w:rPr>
+              <w:t>17/22</w:t>
+            </w:r>
+          </w:p>
+        </w:tc>
+        <w:tc>
+          <w:tcPr>
+            <w:tcW w:type="dxa" w:w="1224"/>
+          </w:tcPr>
+          <w:p>
+            <w:r/>
+            <w:r>
+              <w:rPr>
+                <w:sz w:val="17"/>
+              </w:rPr>
+              <w:t>77%</w:t>
+            </w:r>
+          </w:p>
+        </w:tc>
+        <w:tc>
+          <w:tcPr>
+            <w:tcW w:type="dxa" w:w="1368"/>
+          </w:tcPr>
+          <w:p>
+            <w:r/>
+            <w:r>
+              <w:rPr>
+                <w:sz w:val="17"/>
+              </w:rPr>
+              <w:t>-38 pts</w:t>
+            </w:r>
+          </w:p>
+        </w:tc>
+      </w:tr>
+      <w:tr>
+        <w:tc>
+          <w:tcPr>
+            <w:tcW w:type="dxa" w:w="504"/>
+          </w:tcPr>
+          <w:p>
+            <w:r/>
+            <w:r>
+              <w:rPr>
+                <w:sz w:val="17"/>
+              </w:rPr>
+              <w:t>15</w:t>
+            </w:r>
+          </w:p>
+        </w:tc>
+        <w:tc>
+          <w:tcPr>
+            <w:tcW w:type="dxa" w:w="3312"/>
+          </w:tcPr>
+          <w:p>
+            <w:r/>
+            <w:r>
+              <w:rPr>
+                <w:sz w:val="17"/>
+              </w:rPr>
+              <w:t>qwen3.5_4b</w:t>
+            </w:r>
+          </w:p>
+        </w:tc>
+        <w:tc>
+          <w:tcPr>
+            <w:tcW w:type="dxa" w:w="720"/>
+          </w:tcPr>
+          <w:p>
+            <w:r/>
+            <w:r>
+              <w:rPr>
+                <w:sz w:val="17"/>
+              </w:rPr>
+              <w:t>OSS</w:t>
+            </w:r>
+          </w:p>
+        </w:tc>
+        <w:tc>
+          <w:tcPr>
+            <w:tcW w:type="dxa" w:w="1368"/>
+          </w:tcPr>
+          <w:p>
+            <w:r/>
+            <w:r>
+              <w:rPr>
+                <w:sz w:val="17"/>
+              </w:rPr>
+              <w:t>4/28</w:t>
+            </w:r>
+          </w:p>
+        </w:tc>
+        <w:tc>
+          <w:tcPr>
+            <w:tcW w:type="dxa" w:w="1224"/>
+          </w:tcPr>
+          <w:p>
+            <w:r/>
+            <w:r>
+              <w:rPr>
+                <w:sz w:val="17"/>
+              </w:rPr>
+              <w:t>14%</w:t>
+            </w:r>
+          </w:p>
+        </w:tc>
+        <w:tc>
+          <w:tcPr>
+            <w:tcW w:type="dxa" w:w="1368"/>
+          </w:tcPr>
+          <w:p>
+            <w:r/>
+            <w:r>
+              <w:rPr>
+                <w:sz w:val="17"/>
+              </w:rPr>
+              <w:t>17/22</w:t>
+            </w:r>
+          </w:p>
+        </w:tc>
+        <w:tc>
+          <w:tcPr>
+            <w:tcW w:type="dxa" w:w="1224"/>
+          </w:tcPr>
+          <w:p>
+            <w:r/>
+            <w:r>
+              <w:rPr>
+                <w:sz w:val="17"/>
+              </w:rPr>
+              <w:t>77%</w:t>
+            </w:r>
+          </w:p>
+        </w:tc>
+        <w:tc>
+          <w:tcPr>
+            <w:tcW w:type="dxa" w:w="1368"/>
+          </w:tcPr>
+          <w:p>
+            <w:r/>
+            <w:r>
+              <w:rPr>
+                <w:sz w:val="17"/>
+              </w:rPr>
+              <w:t>-63 pts</w:t>
+            </w:r>
+          </w:p>
+        </w:tc>
+      </w:tr>
+      <w:tr>
+        <w:tc>
+          <w:tcPr>
+            <w:tcW w:type="dxa" w:w="504"/>
+          </w:tcPr>
+          <w:p>
+            <w:r/>
+            <w:r>
+              <w:rPr>
+                <w:sz w:val="17"/>
+              </w:rPr>
+              <w:t>16</w:t>
+            </w:r>
+          </w:p>
+        </w:tc>
+        <w:tc>
+          <w:tcPr>
+            <w:tcW w:type="dxa" w:w="3312"/>
+          </w:tcPr>
+          <w:p>
+            <w:r/>
+            <w:r>
+              <w:rPr>
+                <w:sz w:val="17"/>
+              </w:rPr>
+              <w:t>deepseek-r1</w:t>
+            </w:r>
+          </w:p>
+        </w:tc>
+        <w:tc>
+          <w:tcPr>
+            <w:tcW w:type="dxa" w:w="720"/>
+          </w:tcPr>
+          <w:p>
+            <w:r/>
+            <w:r>
+              <w:rPr>
+                <w:sz w:val="17"/>
+              </w:rPr>
+              <w:t>API</w:t>
+            </w:r>
+          </w:p>
+        </w:tc>
+        <w:tc>
+          <w:tcPr>
+            <w:tcW w:type="dxa" w:w="1368"/>
+          </w:tcPr>
+          <w:p>
+            <w:r/>
+            <w:r>
+              <w:rPr>
+                <w:sz w:val="17"/>
+              </w:rPr>
+              <w:t>0/28</w:t>
+            </w:r>
+          </w:p>
+        </w:tc>
+        <w:tc>
+          <w:tcPr>
+            <w:tcW w:type="dxa" w:w="1224"/>
+          </w:tcPr>
+          <w:p>
+            <w:r/>
+            <w:r>
+              <w:rPr>
+                <w:sz w:val="17"/>
+              </w:rPr>
+              <w:t>0%</w:t>
+            </w:r>
+          </w:p>
+        </w:tc>
+        <w:tc>
+          <w:tcPr>
+            <w:tcW w:type="dxa" w:w="1368"/>
+          </w:tcPr>
+          <w:p>
+            <w:r/>
+            <w:r>
+              <w:rPr>
+                <w:sz w:val="17"/>
+              </w:rPr>
+              <w:t>4/22</w:t>
+            </w:r>
+          </w:p>
+        </w:tc>
+        <w:tc>
+          <w:tcPr>
+            <w:tcW w:type="dxa" w:w="1224"/>
+          </w:tcPr>
+          <w:p>
+            <w:r/>
+            <w:r>
+              <w:rPr>
+                <w:sz w:val="17"/>
+              </w:rPr>
+              <w:t>18%</w:t>
+            </w:r>
+          </w:p>
+        </w:tc>
+        <w:tc>
+          <w:tcPr>
+            <w:tcW w:type="dxa" w:w="1368"/>
+          </w:tcPr>
+          <w:p>
+            <w:r/>
+            <w:r>
+              <w:rPr>
+                <w:sz w:val="17"/>
+              </w:rPr>
+              <w:t>-18 pts</w:t>
+            </w:r>
+          </w:p>
+        </w:tc>
+      </w:tr>
+    </w:tbl>
     <w:p>
       <w:pPr>
         <w:sectPr>

</xml_diff>

<commit_message>
docs(evals): mt50 report — six personas, not five (probe_resistant was omitted)
</commit_message>
<xml_diff>
--- a/offline_eval/multi_turn_results/MT50_BOARD_INTERIM_2026-07-26.docx
+++ b/offline_eval/multi_turn_results/MT50_BOARD_INTERIM_2026-07-26.docx
@@ -48,7 +48,7 @@
           <w:b w:val="0"/>
           <w:i w:val="0"/>
         </w:rPr>
-        <w:t>Each candidate model acts as the tutor inside the production simple_tutor engine and teaches 50 complete, simulated tutoring lessons. Everything except the tutor model is held constant: the same 50 scenarios (a seeded draw — every model sees the identical set), the same student simulator (Anthropic Haiku 4.5 playing five student personas), the same judge (Anthropic Sonnet 4.6 at temperature 0 scoring each finished transcript against a session-level teaching rubric), and the same engine guard stack. A model's score is therefore attributable to the model alone.</w:t>
+        <w:t>Each candidate model acts as the tutor inside the production simple_tutor engine and teaches 50 complete, simulated tutoring lessons. Everything except the tutor model is held constant: the same 50 scenarios (a seeded draw — every model sees the identical set), the same student simulator (Anthropic Haiku 4.5 playing six student personas), the same judge (Anthropic Sonnet 4.6 at temperature 0 scoring each finished transcript against a session-level teaching rubric), and the same engine guard stack. A model's score is therefore attributable to the model alone.</w:t>
       </w:r>
     </w:p>
     <w:p>
@@ -88,7 +88,7 @@
           <w:b w:val="0"/>
           <w:i w:val="0"/>
         </w:rPr>
-        <w:t>A scenario is a test specification stored as one YAML file under evals/dataset/multi_turn/ — it names a lesson from the Seychelles curriculum fixture, a student persona (capable, average, struggler, error_prone, or non_responder), a conversation shape (e.g. refusal_chain, speedrun, error_cascade, remediation), deterministic assertions (turn budget, no repetition, no tool-syntax leaks, expected ending), and rubric items for the judge. Example: evals/dataset/multi_turn/refusal_chain_non_responder_1141_12.yaml pits the tutor against a student who answers "idk" repeatedly during a probability lesson.</w:t>
+        <w:t>A scenario is a test specification stored as one YAML file under evals/dataset/multi_turn/ — it names a lesson from the Seychelles curriculum fixture, a student persona (capable, average, struggler, error_prone, non_responder, or probe_resistant), a conversation shape (e.g. refusal_chain, speedrun, error_cascade, remediation), deterministic assertions (turn budget, no repetition, no tool-syntax leaks, expected ending), and rubric items for the judge. Example: evals/dataset/multi_turn/refusal_chain_non_responder_1141_12.yaml pits the tutor against a student who answers "idk" repeatedly during a probability lesson.</w:t>
       </w:r>
     </w:p>
     <w:p>

</xml_diff>

<commit_message>
offline_eval: mt50 board complete — Colab legs in, report finalized
Five Colab legs merged (all zero errors): grok-4.1-fast-non-reasoning
45/50, grok-4.20-reasoning 44/50, grok-4.1-fast-reasoning 43/50,
gemini-2.5-pro re-run 43/50, grok-4.20-non-reasoning 41/50. Board is
final at 26 models; qwen3.6:35b-a3b excluded by decision. Report
updated: final leaderboard + subject table, roster notes (480b/235b
re-added, dupes best-of-two rule), frontier now includes the open
qwen3-next-80b-thinking; gemini-2.5-pro incident closed.

Refs: offline_eval/cloud_models_mt50c.txt
</commit_message>
<xml_diff>
--- a/offline_eval/multi_turn_results/MT50_BOARD_INTERIM_2026-07-26.docx
+++ b/offline_eval/multi_turn_results/MT50_BOARD_INTERIM_2026-07-26.docx
@@ -7,7 +7,7 @@
         <w:pStyle w:val="Title"/>
       </w:pPr>
       <w:r>
-        <w:t>mt50 Multi-Turn Benchmark — Interim Report</w:t>
+        <w:t>mt50 Multi-Turn Benchmark — Board Report</w:t>
       </w:r>
     </w:p>
     <w:p>
@@ -28,7 +28,7 @@
           <w:color w:val="55635F"/>
           <w:sz w:val="19"/>
         </w:rPr>
-        <w:t>Generated 2026-07-26 · 16 of 19 models complete · run in progress — remaining results will be appended to this report</w:t>
+        <w:t>Updated 2026-07-27 · board complete: 26 models · zero infrastructure errors across every leg</w:t>
       </w:r>
     </w:p>
     <w:p>
@@ -149,7 +149,7 @@
         <w:rPr>
           <w:color w:val="0E7C6B"/>
         </w:rPr>
-        <w:t>3. Leaderboard — interim (16 of 19 models)</w:t>
+        <w:t>3. Leaderboard — final (26 models, 50 sessions each)</w:t>
       </w:r>
     </w:p>
     <w:p>
@@ -500,7 +500,7 @@
               <w:rPr>
                 <w:sz w:val="17"/>
               </w:rPr>
-              <w:t>claude-opus-4-7</w:t>
+              <w:t>qwen3-next-80b-thinking</w:t>
             </w:r>
           </w:p>
         </w:tc>
@@ -528,7 +528,7 @@
               <w:rPr>
                 <w:sz w:val="17"/>
               </w:rPr>
-              <w:t>46/50</w:t>
+              <w:t>47/50</w:t>
             </w:r>
           </w:p>
         </w:tc>
@@ -542,7 +542,7 @@
               <w:rPr>
                 <w:sz w:val="17"/>
               </w:rPr>
-              <w:t>92%</w:t>
+              <w:t>94%</w:t>
             </w:r>
           </w:p>
         </w:tc>
@@ -556,7 +556,7 @@
               <w:rPr>
                 <w:sz w:val="17"/>
               </w:rPr>
-              <w:t>[81, 97]</w:t>
+              <w:t>[84, 98]</w:t>
             </w:r>
           </w:p>
         </w:tc>
@@ -570,7 +570,7 @@
               <w:rPr>
                 <w:sz w:val="17"/>
               </w:rPr>
-              <w:t>1.9</w:t>
+              <w:t>23.3</w:t>
             </w:r>
           </w:p>
         </w:tc>
@@ -584,7 +584,7 @@
               <w:rPr>
                 <w:sz w:val="17"/>
               </w:rPr>
-              <w:t>1.6 h</w:t>
+              <w:t>19.4 h</w:t>
             </w:r>
           </w:p>
         </w:tc>
@@ -598,7 +598,7 @@
               <w:rPr>
                 <w:sz w:val="17"/>
               </w:rPr>
-              <w:t>9.8</w:t>
+              <w:t>10.0</w:t>
             </w:r>
           </w:p>
         </w:tc>
@@ -612,7 +612,7 @@
               <w:rPr>
                 <w:sz w:val="17"/>
               </w:rPr>
-              <w:t>exit_ticket: 46  max_turns: 4</w:t>
+              <w:t>exit_ticket: 47  max_turns: 3</w:t>
             </w:r>
           </w:p>
         </w:tc>
@@ -642,7 +642,7 @@
               <w:rPr>
                 <w:sz w:val="17"/>
               </w:rPr>
-              <w:t>claude-sonnet-4-6</w:t>
+              <w:t>claude-opus-4-7</w:t>
             </w:r>
           </w:p>
         </w:tc>
@@ -712,7 +712,7 @@
               <w:rPr>
                 <w:sz w:val="17"/>
               </w:rPr>
-              <w:t>1.8</w:t>
+              <w:t>1.9</w:t>
             </w:r>
           </w:p>
         </w:tc>
@@ -726,7 +726,7 @@
               <w:rPr>
                 <w:sz w:val="17"/>
               </w:rPr>
-              <w:t>1.5 h</w:t>
+              <w:t>1.6 h</w:t>
             </w:r>
           </w:p>
         </w:tc>
@@ -740,7 +740,7 @@
               <w:rPr>
                 <w:sz w:val="17"/>
               </w:rPr>
-              <w:t>8.8</w:t>
+              <w:t>9.8</w:t>
             </w:r>
           </w:p>
         </w:tc>
@@ -754,7 +754,7 @@
               <w:rPr>
                 <w:sz w:val="17"/>
               </w:rPr>
-              <w:t>exit_ticket: 47  max_turns: 3</w:t>
+              <w:t>exit_ticket: 46  max_turns: 4</w:t>
             </w:r>
           </w:p>
         </w:tc>
@@ -784,7 +784,7 @@
               <w:rPr>
                 <w:sz w:val="17"/>
               </w:rPr>
-              <w:t>gemini-3.1-pro</w:t>
+              <w:t>claude-sonnet-4-6</w:t>
             </w:r>
           </w:p>
         </w:tc>
@@ -854,7 +854,7 @@
               <w:rPr>
                 <w:sz w:val="17"/>
               </w:rPr>
-              <w:t>8.9</w:t>
+              <w:t>1.8</w:t>
             </w:r>
           </w:p>
         </w:tc>
@@ -868,7 +868,7 @@
               <w:rPr>
                 <w:sz w:val="17"/>
               </w:rPr>
-              <w:t>7.4 h</w:t>
+              <w:t>1.5 h</w:t>
             </w:r>
           </w:p>
         </w:tc>
@@ -882,7 +882,7 @@
               <w:rPr>
                 <w:sz w:val="17"/>
               </w:rPr>
-              <w:t>9.5</w:t>
+              <w:t>8.8</w:t>
             </w:r>
           </w:p>
         </w:tc>
@@ -926,7 +926,7 @@
               <w:rPr>
                 <w:sz w:val="17"/>
               </w:rPr>
-              <w:t>gemini-2.5-flash</w:t>
+              <w:t>gemini-3.1-pro</w:t>
             </w:r>
           </w:p>
         </w:tc>
@@ -954,7 +954,7 @@
               <w:rPr>
                 <w:sz w:val="17"/>
               </w:rPr>
-              <w:t>44/50</w:t>
+              <w:t>46/50</w:t>
             </w:r>
           </w:p>
         </w:tc>
@@ -968,7 +968,7 @@
               <w:rPr>
                 <w:sz w:val="17"/>
               </w:rPr>
-              <w:t>88%</w:t>
+              <w:t>92%</w:t>
             </w:r>
           </w:p>
         </w:tc>
@@ -982,7 +982,7 @@
               <w:rPr>
                 <w:sz w:val="17"/>
               </w:rPr>
-              <w:t>[76, 94]</w:t>
+              <w:t>[81, 97]</w:t>
             </w:r>
           </w:p>
         </w:tc>
@@ -996,7 +996,7 @@
               <w:rPr>
                 <w:sz w:val="17"/>
               </w:rPr>
-              <w:t>1.7</w:t>
+              <w:t>8.9</w:t>
             </w:r>
           </w:p>
         </w:tc>
@@ -1010,7 +1010,7 @@
               <w:rPr>
                 <w:sz w:val="17"/>
               </w:rPr>
-              <w:t>1.4 h</w:t>
+              <w:t>7.4 h</w:t>
             </w:r>
           </w:p>
         </w:tc>
@@ -1024,7 +1024,7 @@
               <w:rPr>
                 <w:sz w:val="17"/>
               </w:rPr>
-              <w:t>9.4</w:t>
+              <w:t>9.5</w:t>
             </w:r>
           </w:p>
         </w:tc>
@@ -1038,7 +1038,7 @@
               <w:rPr>
                 <w:sz w:val="17"/>
               </w:rPr>
-              <w:t>exit_ticket: 46  max_turns: 4</w:t>
+              <w:t>exit_ticket: 47  max_turns: 3</w:t>
             </w:r>
           </w:p>
         </w:tc>
@@ -1068,7 +1068,7 @@
               <w:rPr>
                 <w:sz w:val="17"/>
               </w:rPr>
-              <w:t>qwen3_4b</w:t>
+              <w:t>glm-5</w:t>
             </w:r>
           </w:p>
         </w:tc>
@@ -1082,7 +1082,7 @@
               <w:rPr>
                 <w:sz w:val="17"/>
               </w:rPr>
-              <w:t>OSS</w:t>
+              <w:t>API</w:t>
             </w:r>
           </w:p>
         </w:tc>
@@ -1096,7 +1096,7 @@
               <w:rPr>
                 <w:sz w:val="17"/>
               </w:rPr>
-              <w:t>44/50</w:t>
+              <w:t>46/50</w:t>
             </w:r>
           </w:p>
         </w:tc>
@@ -1110,7 +1110,7 @@
               <w:rPr>
                 <w:sz w:val="17"/>
               </w:rPr>
-              <w:t>88%</w:t>
+              <w:t>92%</w:t>
             </w:r>
           </w:p>
         </w:tc>
@@ -1124,7 +1124,7 @@
               <w:rPr>
                 <w:sz w:val="17"/>
               </w:rPr>
-              <w:t>[76, 94]</w:t>
+              <w:t>[81, 97]</w:t>
             </w:r>
           </w:p>
         </w:tc>
@@ -1138,7 +1138,7 @@
               <w:rPr>
                 <w:sz w:val="17"/>
               </w:rPr>
-              <w:t>27.3</w:t>
+              <w:t>4.2</w:t>
             </w:r>
           </w:p>
         </w:tc>
@@ -1152,7 +1152,7 @@
               <w:rPr>
                 <w:sz w:val="17"/>
               </w:rPr>
-              <w:t>22.8 h</w:t>
+              <w:t>3.5 h</w:t>
             </w:r>
           </w:p>
         </w:tc>
@@ -1166,7 +1166,7 @@
               <w:rPr>
                 <w:sz w:val="17"/>
               </w:rPr>
-              <w:t>10.6</w:t>
+              <w:t>9.6</w:t>
             </w:r>
           </w:p>
         </w:tc>
@@ -1180,7 +1180,7 @@
               <w:rPr>
                 <w:sz w:val="17"/>
               </w:rPr>
-              <w:t>exit_ticket: 46  max_turns: 4</w:t>
+              <w:t>exit_ticket: 47  max_turns: 3</w:t>
             </w:r>
           </w:p>
         </w:tc>
@@ -1210,7 +1210,7 @@
               <w:rPr>
                 <w:sz w:val="17"/>
               </w:rPr>
-              <w:t>deepseek-v3.1</w:t>
+              <w:t>grok-4.1-fast-non-reasoning</w:t>
             </w:r>
           </w:p>
         </w:tc>
@@ -1238,7 +1238,7 @@
               <w:rPr>
                 <w:sz w:val="17"/>
               </w:rPr>
-              <w:t>43/50</w:t>
+              <w:t>45/50</w:t>
             </w:r>
           </w:p>
         </w:tc>
@@ -1252,7 +1252,7 @@
               <w:rPr>
                 <w:sz w:val="17"/>
               </w:rPr>
-              <w:t>86%</w:t>
+              <w:t>90%</w:t>
             </w:r>
           </w:p>
         </w:tc>
@@ -1266,7 +1266,7 @@
               <w:rPr>
                 <w:sz w:val="17"/>
               </w:rPr>
-              <w:t>[74, 93]</w:t>
+              <w:t>[79, 96]</w:t>
             </w:r>
           </w:p>
         </w:tc>
@@ -1280,7 +1280,7 @@
               <w:rPr>
                 <w:sz w:val="17"/>
               </w:rPr>
-              <w:t>2.3</w:t>
+              <w:t>0.8</w:t>
             </w:r>
           </w:p>
         </w:tc>
@@ -1294,7 +1294,7 @@
               <w:rPr>
                 <w:sz w:val="17"/>
               </w:rPr>
-              <w:t>1.9 h</w:t>
+              <w:t>0.6 h</w:t>
             </w:r>
           </w:p>
         </w:tc>
@@ -1322,7 +1322,7 @@
               <w:rPr>
                 <w:sz w:val="17"/>
               </w:rPr>
-              <w:t>exit_ticket: 46  max_turns: 4</w:t>
+              <w:t>exit_ticket: 47  max_turns: 3</w:t>
             </w:r>
           </w:p>
         </w:tc>
@@ -1352,7 +1352,7 @@
               <w:rPr>
                 <w:sz w:val="17"/>
               </w:rPr>
-              <w:t>kimi-k2-thinking</w:t>
+              <w:t>gemini-2.5-flash</w:t>
             </w:r>
           </w:p>
         </w:tc>
@@ -1380,7 +1380,7 @@
               <w:rPr>
                 <w:sz w:val="17"/>
               </w:rPr>
-              <w:t>43/50</w:t>
+              <w:t>44/50</w:t>
             </w:r>
           </w:p>
         </w:tc>
@@ -1394,7 +1394,7 @@
               <w:rPr>
                 <w:sz w:val="17"/>
               </w:rPr>
-              <w:t>86%</w:t>
+              <w:t>88%</w:t>
             </w:r>
           </w:p>
         </w:tc>
@@ -1408,7 +1408,7 @@
               <w:rPr>
                 <w:sz w:val="17"/>
               </w:rPr>
-              <w:t>[74, 93]</w:t>
+              <w:t>[76, 94]</w:t>
             </w:r>
           </w:p>
         </w:tc>
@@ -1422,7 +1422,7 @@
               <w:rPr>
                 <w:sz w:val="17"/>
               </w:rPr>
-              <w:t>6.9</w:t>
+              <w:t>1.7</w:t>
             </w:r>
           </w:p>
         </w:tc>
@@ -1436,7 +1436,7 @@
               <w:rPr>
                 <w:sz w:val="17"/>
               </w:rPr>
-              <w:t>5.7 h</w:t>
+              <w:t>1.4 h</w:t>
             </w:r>
           </w:p>
         </w:tc>
@@ -1450,7 +1450,7 @@
               <w:rPr>
                 <w:sz w:val="17"/>
               </w:rPr>
-              <w:t>10.3</w:t>
+              <w:t>9.4</w:t>
             </w:r>
           </w:p>
         </w:tc>
@@ -1464,7 +1464,7 @@
               <w:rPr>
                 <w:sz w:val="17"/>
               </w:rPr>
-              <w:t>exit_ticket: 47  max_turns: 3</w:t>
+              <w:t>exit_ticket: 46  max_turns: 4</w:t>
             </w:r>
           </w:p>
         </w:tc>
@@ -1494,7 +1494,7 @@
               <w:rPr>
                 <w:sz w:val="17"/>
               </w:rPr>
-              <w:t>deepseek-v3.2</w:t>
+              <w:t>glm-4.7</w:t>
             </w:r>
           </w:p>
         </w:tc>
@@ -1522,7 +1522,7 @@
               <w:rPr>
                 <w:sz w:val="17"/>
               </w:rPr>
-              <w:t>42/50</w:t>
+              <w:t>44/50</w:t>
             </w:r>
           </w:p>
         </w:tc>
@@ -1536,7 +1536,7 @@
               <w:rPr>
                 <w:sz w:val="17"/>
               </w:rPr>
-              <w:t>84%</w:t>
+              <w:t>88%</w:t>
             </w:r>
           </w:p>
         </w:tc>
@@ -1550,7 +1550,7 @@
               <w:rPr>
                 <w:sz w:val="17"/>
               </w:rPr>
-              <w:t>[71, 92]</w:t>
+              <w:t>[76, 94]</w:t>
             </w:r>
           </w:p>
         </w:tc>
@@ -1564,7 +1564,7 @@
               <w:rPr>
                 <w:sz w:val="17"/>
               </w:rPr>
-              <w:t>3.1</w:t>
+              <w:t>3.5</w:t>
             </w:r>
           </w:p>
         </w:tc>
@@ -1578,7 +1578,7 @@
               <w:rPr>
                 <w:sz w:val="17"/>
               </w:rPr>
-              <w:t>2.5 h</w:t>
+              <w:t>2.9 h</w:t>
             </w:r>
           </w:p>
         </w:tc>
@@ -1592,7 +1592,7 @@
               <w:rPr>
                 <w:sz w:val="17"/>
               </w:rPr>
-              <w:t>11.3</w:t>
+              <w:t>9.9</w:t>
             </w:r>
           </w:p>
         </w:tc>
@@ -1606,7 +1606,7 @@
               <w:rPr>
                 <w:sz w:val="17"/>
               </w:rPr>
-              <w:t>exit_ticket: 45  max_turns: 5</w:t>
+              <w:t>exit_ticket: 46  max_turns: 4</w:t>
             </w:r>
           </w:p>
         </w:tc>
@@ -1636,7 +1636,7 @@
               <w:rPr>
                 <w:sz w:val="17"/>
               </w:rPr>
-              <w:t>qwen3_30b-a3b</w:t>
+              <w:t>grok-4.20-reasoning</w:t>
             </w:r>
           </w:p>
         </w:tc>
@@ -1650,7 +1650,7 @@
               <w:rPr>
                 <w:sz w:val="17"/>
               </w:rPr>
-              <w:t>OSS</w:t>
+              <w:t>API</w:t>
             </w:r>
           </w:p>
         </w:tc>
@@ -1664,7 +1664,7 @@
               <w:rPr>
                 <w:sz w:val="17"/>
               </w:rPr>
-              <w:t>42/50</w:t>
+              <w:t>44/50</w:t>
             </w:r>
           </w:p>
         </w:tc>
@@ -1678,7 +1678,7 @@
               <w:rPr>
                 <w:sz w:val="17"/>
               </w:rPr>
-              <w:t>84%</w:t>
+              <w:t>88%</w:t>
             </w:r>
           </w:p>
         </w:tc>
@@ -1692,7 +1692,7 @@
               <w:rPr>
                 <w:sz w:val="17"/>
               </w:rPr>
-              <w:t>[71, 92]</w:t>
+              <w:t>[76, 94]</w:t>
             </w:r>
           </w:p>
         </w:tc>
@@ -1706,7 +1706,7 @@
               <w:rPr>
                 <w:sz w:val="17"/>
               </w:rPr>
-              <w:t>5.4</w:t>
+              <w:t>3.8</w:t>
             </w:r>
           </w:p>
         </w:tc>
@@ -1720,7 +1720,7 @@
               <w:rPr>
                 <w:sz w:val="17"/>
               </w:rPr>
-              <w:t>4.5 h</w:t>
+              <w:t>3.2 h</w:t>
             </w:r>
           </w:p>
         </w:tc>
@@ -1748,7 +1748,7 @@
               <w:rPr>
                 <w:sz w:val="17"/>
               </w:rPr>
-              <w:t>exit_ticket: 46  max_turns: 4</w:t>
+              <w:t>exit_ticket: 47  max_turns: 3</w:t>
             </w:r>
           </w:p>
         </w:tc>
@@ -1778,7 +1778,7 @@
               <w:rPr>
                 <w:sz w:val="17"/>
               </w:rPr>
-              <w:t>qwen3-next-80b-instruct</w:t>
+              <w:t>qwen3_4b</w:t>
             </w:r>
           </w:p>
         </w:tc>
@@ -1792,7 +1792,7 @@
               <w:rPr>
                 <w:sz w:val="17"/>
               </w:rPr>
-              <w:t>API</w:t>
+              <w:t>OSS</w:t>
             </w:r>
           </w:p>
         </w:tc>
@@ -1806,7 +1806,7 @@
               <w:rPr>
                 <w:sz w:val="17"/>
               </w:rPr>
-              <w:t>41/50</w:t>
+              <w:t>44/50</w:t>
             </w:r>
           </w:p>
         </w:tc>
@@ -1820,7 +1820,7 @@
               <w:rPr>
                 <w:sz w:val="17"/>
               </w:rPr>
-              <w:t>82%</w:t>
+              <w:t>88%</w:t>
             </w:r>
           </w:p>
         </w:tc>
@@ -1834,7 +1834,7 @@
               <w:rPr>
                 <w:sz w:val="17"/>
               </w:rPr>
-              <w:t>[69, 90]</w:t>
+              <w:t>[76, 94]</w:t>
             </w:r>
           </w:p>
         </w:tc>
@@ -1848,7 +1848,7 @@
               <w:rPr>
                 <w:sz w:val="17"/>
               </w:rPr>
-              <w:t>2.5</w:t>
+              <w:t>27.3</w:t>
             </w:r>
           </w:p>
         </w:tc>
@@ -1862,7 +1862,7 @@
               <w:rPr>
                 <w:sz w:val="17"/>
               </w:rPr>
-              <w:t>2.1 h</w:t>
+              <w:t>22.8 h</w:t>
             </w:r>
           </w:p>
         </w:tc>
@@ -1876,7 +1876,7 @@
               <w:rPr>
                 <w:sz w:val="17"/>
               </w:rPr>
-              <w:t>10.7</w:t>
+              <w:t>10.6</w:t>
             </w:r>
           </w:p>
         </w:tc>
@@ -1890,7 +1890,7 @@
               <w:rPr>
                 <w:sz w:val="17"/>
               </w:rPr>
-              <w:t>exit_ticket: 47  max_turns: 3</w:t>
+              <w:t>exit_ticket: 46  max_turns: 4</w:t>
             </w:r>
           </w:p>
         </w:tc>
@@ -1920,7 +1920,7 @@
               <w:rPr>
                 <w:sz w:val="17"/>
               </w:rPr>
-              <w:t>claude-haiku-4-5</w:t>
+              <w:t>deepseek-v3.1</w:t>
             </w:r>
           </w:p>
         </w:tc>
@@ -1948,7 +1948,7 @@
               <w:rPr>
                 <w:sz w:val="17"/>
               </w:rPr>
-              <w:t>39/50</w:t>
+              <w:t>43/50</w:t>
             </w:r>
           </w:p>
         </w:tc>
@@ -1962,7 +1962,7 @@
               <w:rPr>
                 <w:sz w:val="17"/>
               </w:rPr>
-              <w:t>78%</w:t>
+              <w:t>86%</w:t>
             </w:r>
           </w:p>
         </w:tc>
@@ -1976,7 +1976,7 @@
               <w:rPr>
                 <w:sz w:val="17"/>
               </w:rPr>
-              <w:t>[65, 87]</w:t>
+              <w:t>[74, 93]</w:t>
             </w:r>
           </w:p>
         </w:tc>
@@ -1990,7 +1990,7 @@
               <w:rPr>
                 <w:sz w:val="17"/>
               </w:rPr>
-              <w:t>1.8</w:t>
+              <w:t>2.3</w:t>
             </w:r>
           </w:p>
         </w:tc>
@@ -2004,7 +2004,7 @@
               <w:rPr>
                 <w:sz w:val="17"/>
               </w:rPr>
-              <w:t>1.5 h</w:t>
+              <w:t>1.9 h</w:t>
             </w:r>
           </w:p>
         </w:tc>
@@ -2018,7 +2018,7 @@
               <w:rPr>
                 <w:sz w:val="17"/>
               </w:rPr>
-              <w:t>11.9</w:t>
+              <w:t>10.0</w:t>
             </w:r>
           </w:p>
         </w:tc>
@@ -2032,7 +2032,7 @@
               <w:rPr>
                 <w:sz w:val="17"/>
               </w:rPr>
-              <w:t>exit_ticket: 44  max_turns: 6</w:t>
+              <w:t>exit_ticket: 46  max_turns: 4</w:t>
             </w:r>
           </w:p>
         </w:tc>
@@ -2062,7 +2062,7 @@
               <w:rPr>
                 <w:sz w:val="17"/>
               </w:rPr>
-              <w:t>qwen3_14b</w:t>
+              <w:t>gemini-2.5-pro</w:t>
             </w:r>
           </w:p>
         </w:tc>
@@ -2076,7 +2076,7 @@
               <w:rPr>
                 <w:sz w:val="17"/>
               </w:rPr>
-              <w:t>OSS</w:t>
+              <w:t>API</w:t>
             </w:r>
           </w:p>
         </w:tc>
@@ -2090,7 +2090,7 @@
               <w:rPr>
                 <w:sz w:val="17"/>
               </w:rPr>
-              <w:t>37/50</w:t>
+              <w:t>43/50</w:t>
             </w:r>
           </w:p>
         </w:tc>
@@ -2104,7 +2104,7 @@
               <w:rPr>
                 <w:sz w:val="17"/>
               </w:rPr>
-              <w:t>74%</w:t>
+              <w:t>86%</w:t>
             </w:r>
           </w:p>
         </w:tc>
@@ -2118,7 +2118,7 @@
               <w:rPr>
                 <w:sz w:val="17"/>
               </w:rPr>
-              <w:t>[60, 84]</w:t>
+              <w:t>[74, 93]</w:t>
             </w:r>
           </w:p>
         </w:tc>
@@ -2132,7 +2132,7 @@
               <w:rPr>
                 <w:sz w:val="17"/>
               </w:rPr>
-              <w:t>9.5</w:t>
+              <w:t>3.9</w:t>
             </w:r>
           </w:p>
         </w:tc>
@@ -2146,7 +2146,7 @@
               <w:rPr>
                 <w:sz w:val="17"/>
               </w:rPr>
-              <w:t>8.0 h</w:t>
+              <w:t>3.3 h</w:t>
             </w:r>
           </w:p>
         </w:tc>
@@ -2160,7 +2160,7 @@
               <w:rPr>
                 <w:sz w:val="17"/>
               </w:rPr>
-              <w:t>12.0</w:t>
+              <w:t>10.4</w:t>
             </w:r>
           </w:p>
         </w:tc>
@@ -2174,7 +2174,7 @@
               <w:rPr>
                 <w:sz w:val="17"/>
               </w:rPr>
-              <w:t>exit_ticket: 41  max_turns: 9</w:t>
+              <w:t>exit_ticket: 47  max_turns: 3</w:t>
             </w:r>
           </w:p>
         </w:tc>
@@ -2204,7 +2204,7 @@
               <w:rPr>
                 <w:sz w:val="17"/>
               </w:rPr>
-              <w:t>qwen3.5_9b</w:t>
+              <w:t>grok-4.1-fast-reasoning</w:t>
             </w:r>
           </w:p>
         </w:tc>
@@ -2218,7 +2218,7 @@
               <w:rPr>
                 <w:sz w:val="17"/>
               </w:rPr>
-              <w:t>OSS</w:t>
+              <w:t>API</w:t>
             </w:r>
           </w:p>
         </w:tc>
@@ -2232,7 +2232,7 @@
               <w:rPr>
                 <w:sz w:val="17"/>
               </w:rPr>
-              <w:t>28/50</w:t>
+              <w:t>43/50</w:t>
             </w:r>
           </w:p>
         </w:tc>
@@ -2246,7 +2246,7 @@
               <w:rPr>
                 <w:sz w:val="17"/>
               </w:rPr>
-              <w:t>56%</w:t>
+              <w:t>86%</w:t>
             </w:r>
           </w:p>
         </w:tc>
@@ -2260,7 +2260,7 @@
               <w:rPr>
                 <w:sz w:val="17"/>
               </w:rPr>
-              <w:t>[42, 69]</w:t>
+              <w:t>[74, 93]</w:t>
             </w:r>
           </w:p>
         </w:tc>
@@ -2274,7 +2274,7 @@
               <w:rPr>
                 <w:sz w:val="17"/>
               </w:rPr>
-              <w:t>10.7</w:t>
+              <w:t>4.0</w:t>
             </w:r>
           </w:p>
         </w:tc>
@@ -2288,7 +2288,7 @@
               <w:rPr>
                 <w:sz w:val="17"/>
               </w:rPr>
-              <w:t>9.0 h</w:t>
+              <w:t>3.3 h</w:t>
             </w:r>
           </w:p>
         </w:tc>
@@ -2302,7 +2302,7 @@
               <w:rPr>
                 <w:sz w:val="17"/>
               </w:rPr>
-              <w:t>14.9</w:t>
+              <w:t>9.7</w:t>
             </w:r>
           </w:p>
         </w:tc>
@@ -2316,7 +2316,7 @@
               <w:rPr>
                 <w:sz w:val="17"/>
               </w:rPr>
-              <w:t>exit_ticket: 38  max_turns: 12</w:t>
+              <w:t>exit_ticket: 47  max_turns: 3</w:t>
             </w:r>
           </w:p>
         </w:tc>
@@ -2346,7 +2346,7 @@
               <w:rPr>
                 <w:sz w:val="17"/>
               </w:rPr>
-              <w:t>qwen3.5_4b</w:t>
+              <w:t>kimi-k2-thinking</w:t>
             </w:r>
           </w:p>
         </w:tc>
@@ -2360,7 +2360,7 @@
               <w:rPr>
                 <w:sz w:val="17"/>
               </w:rPr>
-              <w:t>OSS</w:t>
+              <w:t>API</w:t>
             </w:r>
           </w:p>
         </w:tc>
@@ -2374,7 +2374,7 @@
               <w:rPr>
                 <w:sz w:val="17"/>
               </w:rPr>
-              <w:t>21/50</w:t>
+              <w:t>43/50</w:t>
             </w:r>
           </w:p>
         </w:tc>
@@ -2388,7 +2388,7 @@
               <w:rPr>
                 <w:sz w:val="17"/>
               </w:rPr>
-              <w:t>42%</w:t>
+              <w:t>86%</w:t>
             </w:r>
           </w:p>
         </w:tc>
@@ -2402,7 +2402,7 @@
               <w:rPr>
                 <w:sz w:val="17"/>
               </w:rPr>
-              <w:t>[29, 56]</w:t>
+              <w:t>[74, 93]</w:t>
             </w:r>
           </w:p>
         </w:tc>
@@ -2416,7 +2416,7 @@
               <w:rPr>
                 <w:sz w:val="17"/>
               </w:rPr>
-              <w:t>6.7</w:t>
+              <w:t>6.9</w:t>
             </w:r>
           </w:p>
         </w:tc>
@@ -2430,7 +2430,7 @@
               <w:rPr>
                 <w:sz w:val="17"/>
               </w:rPr>
-              <w:t>5.6 h</w:t>
+              <w:t>5.7 h</w:t>
             </w:r>
           </w:p>
         </w:tc>
@@ -2444,7 +2444,7 @@
               <w:rPr>
                 <w:sz w:val="17"/>
               </w:rPr>
-              <w:t>16.9</w:t>
+              <w:t>10.3</w:t>
             </w:r>
           </w:p>
         </w:tc>
@@ -2458,7 +2458,7 @@
               <w:rPr>
                 <w:sz w:val="17"/>
               </w:rPr>
-              <w:t>exit_ticket: 27  max_turns: 23</w:t>
+              <w:t>exit_ticket: 47  max_turns: 3</w:t>
             </w:r>
           </w:p>
         </w:tc>
@@ -2475,6 +2475,1426 @@
                 <w:sz w:val="17"/>
               </w:rPr>
               <w:t>16</w:t>
+            </w:r>
+          </w:p>
+        </w:tc>
+        <w:tc>
+          <w:tcPr>
+            <w:tcW w:type="dxa" w:w="3024"/>
+          </w:tcPr>
+          <w:p>
+            <w:r/>
+            <w:r>
+              <w:rPr>
+                <w:sz w:val="17"/>
+              </w:rPr>
+              <w:t>qwen3-coder-480b</w:t>
+            </w:r>
+          </w:p>
+        </w:tc>
+        <w:tc>
+          <w:tcPr>
+            <w:tcW w:type="dxa" w:w="720"/>
+          </w:tcPr>
+          <w:p>
+            <w:r/>
+            <w:r>
+              <w:rPr>
+                <w:sz w:val="17"/>
+              </w:rPr>
+              <w:t>API</w:t>
+            </w:r>
+          </w:p>
+        </w:tc>
+        <w:tc>
+          <w:tcPr>
+            <w:tcW w:type="dxa" w:w="1008"/>
+          </w:tcPr>
+          <w:p>
+            <w:r/>
+            <w:r>
+              <w:rPr>
+                <w:sz w:val="17"/>
+              </w:rPr>
+              <w:t>43/50</w:t>
+            </w:r>
+          </w:p>
+        </w:tc>
+        <w:tc>
+          <w:tcPr>
+            <w:tcW w:type="dxa" w:w="864"/>
+          </w:tcPr>
+          <w:p>
+            <w:r/>
+            <w:r>
+              <w:rPr>
+                <w:sz w:val="17"/>
+              </w:rPr>
+              <w:t>86%</w:t>
+            </w:r>
+          </w:p>
+        </w:tc>
+        <w:tc>
+          <w:tcPr>
+            <w:tcW w:type="dxa" w:w="1296"/>
+          </w:tcPr>
+          <w:p>
+            <w:r/>
+            <w:r>
+              <w:rPr>
+                <w:sz w:val="17"/>
+              </w:rPr>
+              <w:t>[74, 93]</w:t>
+            </w:r>
+          </w:p>
+        </w:tc>
+        <w:tc>
+          <w:tcPr>
+            <w:tcW w:type="dxa" w:w="1296"/>
+          </w:tcPr>
+          <w:p>
+            <w:r/>
+            <w:r>
+              <w:rPr>
+                <w:sz w:val="17"/>
+              </w:rPr>
+              <w:t>3.1</w:t>
+            </w:r>
+          </w:p>
+        </w:tc>
+        <w:tc>
+          <w:tcPr>
+            <w:tcW w:type="dxa" w:w="1152"/>
+          </w:tcPr>
+          <w:p>
+            <w:r/>
+            <w:r>
+              <w:rPr>
+                <w:sz w:val="17"/>
+              </w:rPr>
+              <w:t>2.6 h</w:t>
+            </w:r>
+          </w:p>
+        </w:tc>
+        <w:tc>
+          <w:tcPr>
+            <w:tcW w:type="dxa" w:w="1152"/>
+          </w:tcPr>
+          <w:p>
+            <w:r/>
+            <w:r>
+              <w:rPr>
+                <w:sz w:val="17"/>
+              </w:rPr>
+              <w:t>10.0</w:t>
+            </w:r>
+          </w:p>
+        </w:tc>
+        <w:tc>
+          <w:tcPr>
+            <w:tcW w:type="dxa" w:w="3456"/>
+          </w:tcPr>
+          <w:p>
+            <w:r/>
+            <w:r>
+              <w:rPr>
+                <w:sz w:val="17"/>
+              </w:rPr>
+              <w:t>exit_ticket: 47  max_turns: 3</w:t>
+            </w:r>
+          </w:p>
+        </w:tc>
+      </w:tr>
+      <w:tr>
+        <w:tc>
+          <w:tcPr>
+            <w:tcW w:type="dxa" w:w="432"/>
+          </w:tcPr>
+          <w:p>
+            <w:r/>
+            <w:r>
+              <w:rPr>
+                <w:sz w:val="17"/>
+              </w:rPr>
+              <w:t>17</w:t>
+            </w:r>
+          </w:p>
+        </w:tc>
+        <w:tc>
+          <w:tcPr>
+            <w:tcW w:type="dxa" w:w="3024"/>
+          </w:tcPr>
+          <w:p>
+            <w:r/>
+            <w:r>
+              <w:rPr>
+                <w:sz w:val="17"/>
+              </w:rPr>
+              <w:t>deepseek-v3.2</w:t>
+            </w:r>
+          </w:p>
+        </w:tc>
+        <w:tc>
+          <w:tcPr>
+            <w:tcW w:type="dxa" w:w="720"/>
+          </w:tcPr>
+          <w:p>
+            <w:r/>
+            <w:r>
+              <w:rPr>
+                <w:sz w:val="17"/>
+              </w:rPr>
+              <w:t>API</w:t>
+            </w:r>
+          </w:p>
+        </w:tc>
+        <w:tc>
+          <w:tcPr>
+            <w:tcW w:type="dxa" w:w="1008"/>
+          </w:tcPr>
+          <w:p>
+            <w:r/>
+            <w:r>
+              <w:rPr>
+                <w:sz w:val="17"/>
+              </w:rPr>
+              <w:t>42/50</w:t>
+            </w:r>
+          </w:p>
+        </w:tc>
+        <w:tc>
+          <w:tcPr>
+            <w:tcW w:type="dxa" w:w="864"/>
+          </w:tcPr>
+          <w:p>
+            <w:r/>
+            <w:r>
+              <w:rPr>
+                <w:sz w:val="17"/>
+              </w:rPr>
+              <w:t>84%</w:t>
+            </w:r>
+          </w:p>
+        </w:tc>
+        <w:tc>
+          <w:tcPr>
+            <w:tcW w:type="dxa" w:w="1296"/>
+          </w:tcPr>
+          <w:p>
+            <w:r/>
+            <w:r>
+              <w:rPr>
+                <w:sz w:val="17"/>
+              </w:rPr>
+              <w:t>[71, 92]</w:t>
+            </w:r>
+          </w:p>
+        </w:tc>
+        <w:tc>
+          <w:tcPr>
+            <w:tcW w:type="dxa" w:w="1296"/>
+          </w:tcPr>
+          <w:p>
+            <w:r/>
+            <w:r>
+              <w:rPr>
+                <w:sz w:val="17"/>
+              </w:rPr>
+              <w:t>3.1</w:t>
+            </w:r>
+          </w:p>
+        </w:tc>
+        <w:tc>
+          <w:tcPr>
+            <w:tcW w:type="dxa" w:w="1152"/>
+          </w:tcPr>
+          <w:p>
+            <w:r/>
+            <w:r>
+              <w:rPr>
+                <w:sz w:val="17"/>
+              </w:rPr>
+              <w:t>2.5 h</w:t>
+            </w:r>
+          </w:p>
+        </w:tc>
+        <w:tc>
+          <w:tcPr>
+            <w:tcW w:type="dxa" w:w="1152"/>
+          </w:tcPr>
+          <w:p>
+            <w:r/>
+            <w:r>
+              <w:rPr>
+                <w:sz w:val="17"/>
+              </w:rPr>
+              <w:t>11.3</w:t>
+            </w:r>
+          </w:p>
+        </w:tc>
+        <w:tc>
+          <w:tcPr>
+            <w:tcW w:type="dxa" w:w="3456"/>
+          </w:tcPr>
+          <w:p>
+            <w:r/>
+            <w:r>
+              <w:rPr>
+                <w:sz w:val="17"/>
+              </w:rPr>
+              <w:t>exit_ticket: 45  max_turns: 5</w:t>
+            </w:r>
+          </w:p>
+        </w:tc>
+      </w:tr>
+      <w:tr>
+        <w:tc>
+          <w:tcPr>
+            <w:tcW w:type="dxa" w:w="432"/>
+          </w:tcPr>
+          <w:p>
+            <w:r/>
+            <w:r>
+              <w:rPr>
+                <w:sz w:val="17"/>
+              </w:rPr>
+              <w:t>18</w:t>
+            </w:r>
+          </w:p>
+        </w:tc>
+        <w:tc>
+          <w:tcPr>
+            <w:tcW w:type="dxa" w:w="3024"/>
+          </w:tcPr>
+          <w:p>
+            <w:r/>
+            <w:r>
+              <w:rPr>
+                <w:sz w:val="17"/>
+              </w:rPr>
+              <w:t>qwen3-235b-instruct</w:t>
+            </w:r>
+          </w:p>
+        </w:tc>
+        <w:tc>
+          <w:tcPr>
+            <w:tcW w:type="dxa" w:w="720"/>
+          </w:tcPr>
+          <w:p>
+            <w:r/>
+            <w:r>
+              <w:rPr>
+                <w:sz w:val="17"/>
+              </w:rPr>
+              <w:t>API</w:t>
+            </w:r>
+          </w:p>
+        </w:tc>
+        <w:tc>
+          <w:tcPr>
+            <w:tcW w:type="dxa" w:w="1008"/>
+          </w:tcPr>
+          <w:p>
+            <w:r/>
+            <w:r>
+              <w:rPr>
+                <w:sz w:val="17"/>
+              </w:rPr>
+              <w:t>42/50</w:t>
+            </w:r>
+          </w:p>
+        </w:tc>
+        <w:tc>
+          <w:tcPr>
+            <w:tcW w:type="dxa" w:w="864"/>
+          </w:tcPr>
+          <w:p>
+            <w:r/>
+            <w:r>
+              <w:rPr>
+                <w:sz w:val="17"/>
+              </w:rPr>
+              <w:t>84%</w:t>
+            </w:r>
+          </w:p>
+        </w:tc>
+        <w:tc>
+          <w:tcPr>
+            <w:tcW w:type="dxa" w:w="1296"/>
+          </w:tcPr>
+          <w:p>
+            <w:r/>
+            <w:r>
+              <w:rPr>
+                <w:sz w:val="17"/>
+              </w:rPr>
+              <w:t>[71, 92]</w:t>
+            </w:r>
+          </w:p>
+        </w:tc>
+        <w:tc>
+          <w:tcPr>
+            <w:tcW w:type="dxa" w:w="1296"/>
+          </w:tcPr>
+          <w:p>
+            <w:r/>
+            <w:r>
+              <w:rPr>
+                <w:sz w:val="17"/>
+              </w:rPr>
+              <w:t>2.4</w:t>
+            </w:r>
+          </w:p>
+        </w:tc>
+        <w:tc>
+          <w:tcPr>
+            <w:tcW w:type="dxa" w:w="1152"/>
+          </w:tcPr>
+          <w:p>
+            <w:r/>
+            <w:r>
+              <w:rPr>
+                <w:sz w:val="17"/>
+              </w:rPr>
+              <w:t>2.0 h</w:t>
+            </w:r>
+          </w:p>
+        </w:tc>
+        <w:tc>
+          <w:tcPr>
+            <w:tcW w:type="dxa" w:w="1152"/>
+          </w:tcPr>
+          <w:p>
+            <w:r/>
+            <w:r>
+              <w:rPr>
+                <w:sz w:val="17"/>
+              </w:rPr>
+              <w:t>10.4</w:t>
+            </w:r>
+          </w:p>
+        </w:tc>
+        <w:tc>
+          <w:tcPr>
+            <w:tcW w:type="dxa" w:w="3456"/>
+          </w:tcPr>
+          <w:p>
+            <w:r/>
+            <w:r>
+              <w:rPr>
+                <w:sz w:val="17"/>
+              </w:rPr>
+              <w:t>exit_ticket: 47  max_turns: 3</w:t>
+            </w:r>
+          </w:p>
+        </w:tc>
+      </w:tr>
+      <w:tr>
+        <w:tc>
+          <w:tcPr>
+            <w:tcW w:type="dxa" w:w="432"/>
+          </w:tcPr>
+          <w:p>
+            <w:r/>
+            <w:r>
+              <w:rPr>
+                <w:sz w:val="17"/>
+              </w:rPr>
+              <w:t>19</w:t>
+            </w:r>
+          </w:p>
+        </w:tc>
+        <w:tc>
+          <w:tcPr>
+            <w:tcW w:type="dxa" w:w="3024"/>
+          </w:tcPr>
+          <w:p>
+            <w:r/>
+            <w:r>
+              <w:rPr>
+                <w:sz w:val="17"/>
+              </w:rPr>
+              <w:t>qwen3_30b-a3b</w:t>
+            </w:r>
+          </w:p>
+        </w:tc>
+        <w:tc>
+          <w:tcPr>
+            <w:tcW w:type="dxa" w:w="720"/>
+          </w:tcPr>
+          <w:p>
+            <w:r/>
+            <w:r>
+              <w:rPr>
+                <w:sz w:val="17"/>
+              </w:rPr>
+              <w:t>OSS</w:t>
+            </w:r>
+          </w:p>
+        </w:tc>
+        <w:tc>
+          <w:tcPr>
+            <w:tcW w:type="dxa" w:w="1008"/>
+          </w:tcPr>
+          <w:p>
+            <w:r/>
+            <w:r>
+              <w:rPr>
+                <w:sz w:val="17"/>
+              </w:rPr>
+              <w:t>42/50</w:t>
+            </w:r>
+          </w:p>
+        </w:tc>
+        <w:tc>
+          <w:tcPr>
+            <w:tcW w:type="dxa" w:w="864"/>
+          </w:tcPr>
+          <w:p>
+            <w:r/>
+            <w:r>
+              <w:rPr>
+                <w:sz w:val="17"/>
+              </w:rPr>
+              <w:t>84%</w:t>
+            </w:r>
+          </w:p>
+        </w:tc>
+        <w:tc>
+          <w:tcPr>
+            <w:tcW w:type="dxa" w:w="1296"/>
+          </w:tcPr>
+          <w:p>
+            <w:r/>
+            <w:r>
+              <w:rPr>
+                <w:sz w:val="17"/>
+              </w:rPr>
+              <w:t>[71, 92]</w:t>
+            </w:r>
+          </w:p>
+        </w:tc>
+        <w:tc>
+          <w:tcPr>
+            <w:tcW w:type="dxa" w:w="1296"/>
+          </w:tcPr>
+          <w:p>
+            <w:r/>
+            <w:r>
+              <w:rPr>
+                <w:sz w:val="17"/>
+              </w:rPr>
+              <w:t>5.4</w:t>
+            </w:r>
+          </w:p>
+        </w:tc>
+        <w:tc>
+          <w:tcPr>
+            <w:tcW w:type="dxa" w:w="1152"/>
+          </w:tcPr>
+          <w:p>
+            <w:r/>
+            <w:r>
+              <w:rPr>
+                <w:sz w:val="17"/>
+              </w:rPr>
+              <w:t>4.5 h</w:t>
+            </w:r>
+          </w:p>
+        </w:tc>
+        <w:tc>
+          <w:tcPr>
+            <w:tcW w:type="dxa" w:w="1152"/>
+          </w:tcPr>
+          <w:p>
+            <w:r/>
+            <w:r>
+              <w:rPr>
+                <w:sz w:val="17"/>
+              </w:rPr>
+              <w:t>9.9</w:t>
+            </w:r>
+          </w:p>
+        </w:tc>
+        <w:tc>
+          <w:tcPr>
+            <w:tcW w:type="dxa" w:w="3456"/>
+          </w:tcPr>
+          <w:p>
+            <w:r/>
+            <w:r>
+              <w:rPr>
+                <w:sz w:val="17"/>
+              </w:rPr>
+              <w:t>exit_ticket: 46  max_turns: 4</w:t>
+            </w:r>
+          </w:p>
+        </w:tc>
+      </w:tr>
+      <w:tr>
+        <w:tc>
+          <w:tcPr>
+            <w:tcW w:type="dxa" w:w="432"/>
+          </w:tcPr>
+          <w:p>
+            <w:r/>
+            <w:r>
+              <w:rPr>
+                <w:sz w:val="17"/>
+              </w:rPr>
+              <w:t>20</w:t>
+            </w:r>
+          </w:p>
+        </w:tc>
+        <w:tc>
+          <w:tcPr>
+            <w:tcW w:type="dxa" w:w="3024"/>
+          </w:tcPr>
+          <w:p>
+            <w:r/>
+            <w:r>
+              <w:rPr>
+                <w:sz w:val="17"/>
+              </w:rPr>
+              <w:t>grok-4.20-non-reasoning</w:t>
+            </w:r>
+          </w:p>
+        </w:tc>
+        <w:tc>
+          <w:tcPr>
+            <w:tcW w:type="dxa" w:w="720"/>
+          </w:tcPr>
+          <w:p>
+            <w:r/>
+            <w:r>
+              <w:rPr>
+                <w:sz w:val="17"/>
+              </w:rPr>
+              <w:t>API</w:t>
+            </w:r>
+          </w:p>
+        </w:tc>
+        <w:tc>
+          <w:tcPr>
+            <w:tcW w:type="dxa" w:w="1008"/>
+          </w:tcPr>
+          <w:p>
+            <w:r/>
+            <w:r>
+              <w:rPr>
+                <w:sz w:val="17"/>
+              </w:rPr>
+              <w:t>41/50</w:t>
+            </w:r>
+          </w:p>
+        </w:tc>
+        <w:tc>
+          <w:tcPr>
+            <w:tcW w:type="dxa" w:w="864"/>
+          </w:tcPr>
+          <w:p>
+            <w:r/>
+            <w:r>
+              <w:rPr>
+                <w:sz w:val="17"/>
+              </w:rPr>
+              <w:t>82%</w:t>
+            </w:r>
+          </w:p>
+        </w:tc>
+        <w:tc>
+          <w:tcPr>
+            <w:tcW w:type="dxa" w:w="1296"/>
+          </w:tcPr>
+          <w:p>
+            <w:r/>
+            <w:r>
+              <w:rPr>
+                <w:sz w:val="17"/>
+              </w:rPr>
+              <w:t>[69, 90]</w:t>
+            </w:r>
+          </w:p>
+        </w:tc>
+        <w:tc>
+          <w:tcPr>
+            <w:tcW w:type="dxa" w:w="1296"/>
+          </w:tcPr>
+          <w:p>
+            <w:r/>
+            <w:r>
+              <w:rPr>
+                <w:sz w:val="17"/>
+              </w:rPr>
+              <w:t>1.5</w:t>
+            </w:r>
+          </w:p>
+        </w:tc>
+        <w:tc>
+          <w:tcPr>
+            <w:tcW w:type="dxa" w:w="1152"/>
+          </w:tcPr>
+          <w:p>
+            <w:r/>
+            <w:r>
+              <w:rPr>
+                <w:sz w:val="17"/>
+              </w:rPr>
+              <w:t>1.2 h</w:t>
+            </w:r>
+          </w:p>
+        </w:tc>
+        <w:tc>
+          <w:tcPr>
+            <w:tcW w:type="dxa" w:w="1152"/>
+          </w:tcPr>
+          <w:p>
+            <w:r/>
+            <w:r>
+              <w:rPr>
+                <w:sz w:val="17"/>
+              </w:rPr>
+              <w:t>9.9</w:t>
+            </w:r>
+          </w:p>
+        </w:tc>
+        <w:tc>
+          <w:tcPr>
+            <w:tcW w:type="dxa" w:w="3456"/>
+          </w:tcPr>
+          <w:p>
+            <w:r/>
+            <w:r>
+              <w:rPr>
+                <w:sz w:val="17"/>
+              </w:rPr>
+              <w:t>exit_ticket: 45  max_turns: 5</w:t>
+            </w:r>
+          </w:p>
+        </w:tc>
+      </w:tr>
+      <w:tr>
+        <w:tc>
+          <w:tcPr>
+            <w:tcW w:type="dxa" w:w="432"/>
+          </w:tcPr>
+          <w:p>
+            <w:r/>
+            <w:r>
+              <w:rPr>
+                <w:sz w:val="17"/>
+              </w:rPr>
+              <w:t>21</w:t>
+            </w:r>
+          </w:p>
+        </w:tc>
+        <w:tc>
+          <w:tcPr>
+            <w:tcW w:type="dxa" w:w="3024"/>
+          </w:tcPr>
+          <w:p>
+            <w:r/>
+            <w:r>
+              <w:rPr>
+                <w:sz w:val="17"/>
+              </w:rPr>
+              <w:t>qwen3-next-80b-instruct</w:t>
+            </w:r>
+          </w:p>
+        </w:tc>
+        <w:tc>
+          <w:tcPr>
+            <w:tcW w:type="dxa" w:w="720"/>
+          </w:tcPr>
+          <w:p>
+            <w:r/>
+            <w:r>
+              <w:rPr>
+                <w:sz w:val="17"/>
+              </w:rPr>
+              <w:t>API</w:t>
+            </w:r>
+          </w:p>
+        </w:tc>
+        <w:tc>
+          <w:tcPr>
+            <w:tcW w:type="dxa" w:w="1008"/>
+          </w:tcPr>
+          <w:p>
+            <w:r/>
+            <w:r>
+              <w:rPr>
+                <w:sz w:val="17"/>
+              </w:rPr>
+              <w:t>41/50</w:t>
+            </w:r>
+          </w:p>
+        </w:tc>
+        <w:tc>
+          <w:tcPr>
+            <w:tcW w:type="dxa" w:w="864"/>
+          </w:tcPr>
+          <w:p>
+            <w:r/>
+            <w:r>
+              <w:rPr>
+                <w:sz w:val="17"/>
+              </w:rPr>
+              <w:t>82%</w:t>
+            </w:r>
+          </w:p>
+        </w:tc>
+        <w:tc>
+          <w:tcPr>
+            <w:tcW w:type="dxa" w:w="1296"/>
+          </w:tcPr>
+          <w:p>
+            <w:r/>
+            <w:r>
+              <w:rPr>
+                <w:sz w:val="17"/>
+              </w:rPr>
+              <w:t>[69, 90]</w:t>
+            </w:r>
+          </w:p>
+        </w:tc>
+        <w:tc>
+          <w:tcPr>
+            <w:tcW w:type="dxa" w:w="1296"/>
+          </w:tcPr>
+          <w:p>
+            <w:r/>
+            <w:r>
+              <w:rPr>
+                <w:sz w:val="17"/>
+              </w:rPr>
+              <w:t>2.5</w:t>
+            </w:r>
+          </w:p>
+        </w:tc>
+        <w:tc>
+          <w:tcPr>
+            <w:tcW w:type="dxa" w:w="1152"/>
+          </w:tcPr>
+          <w:p>
+            <w:r/>
+            <w:r>
+              <w:rPr>
+                <w:sz w:val="17"/>
+              </w:rPr>
+              <w:t>2.1 h</w:t>
+            </w:r>
+          </w:p>
+        </w:tc>
+        <w:tc>
+          <w:tcPr>
+            <w:tcW w:type="dxa" w:w="1152"/>
+          </w:tcPr>
+          <w:p>
+            <w:r/>
+            <w:r>
+              <w:rPr>
+                <w:sz w:val="17"/>
+              </w:rPr>
+              <w:t>10.7</w:t>
+            </w:r>
+          </w:p>
+        </w:tc>
+        <w:tc>
+          <w:tcPr>
+            <w:tcW w:type="dxa" w:w="3456"/>
+          </w:tcPr>
+          <w:p>
+            <w:r/>
+            <w:r>
+              <w:rPr>
+                <w:sz w:val="17"/>
+              </w:rPr>
+              <w:t>exit_ticket: 47  max_turns: 3</w:t>
+            </w:r>
+          </w:p>
+        </w:tc>
+      </w:tr>
+      <w:tr>
+        <w:tc>
+          <w:tcPr>
+            <w:tcW w:type="dxa" w:w="432"/>
+          </w:tcPr>
+          <w:p>
+            <w:r/>
+            <w:r>
+              <w:rPr>
+                <w:sz w:val="17"/>
+              </w:rPr>
+              <w:t>22</w:t>
+            </w:r>
+          </w:p>
+        </w:tc>
+        <w:tc>
+          <w:tcPr>
+            <w:tcW w:type="dxa" w:w="3024"/>
+          </w:tcPr>
+          <w:p>
+            <w:r/>
+            <w:r>
+              <w:rPr>
+                <w:sz w:val="17"/>
+              </w:rPr>
+              <w:t>claude-haiku-4-5</w:t>
+            </w:r>
+          </w:p>
+        </w:tc>
+        <w:tc>
+          <w:tcPr>
+            <w:tcW w:type="dxa" w:w="720"/>
+          </w:tcPr>
+          <w:p>
+            <w:r/>
+            <w:r>
+              <w:rPr>
+                <w:sz w:val="17"/>
+              </w:rPr>
+              <w:t>API</w:t>
+            </w:r>
+          </w:p>
+        </w:tc>
+        <w:tc>
+          <w:tcPr>
+            <w:tcW w:type="dxa" w:w="1008"/>
+          </w:tcPr>
+          <w:p>
+            <w:r/>
+            <w:r>
+              <w:rPr>
+                <w:sz w:val="17"/>
+              </w:rPr>
+              <w:t>39/50</w:t>
+            </w:r>
+          </w:p>
+        </w:tc>
+        <w:tc>
+          <w:tcPr>
+            <w:tcW w:type="dxa" w:w="864"/>
+          </w:tcPr>
+          <w:p>
+            <w:r/>
+            <w:r>
+              <w:rPr>
+                <w:sz w:val="17"/>
+              </w:rPr>
+              <w:t>78%</w:t>
+            </w:r>
+          </w:p>
+        </w:tc>
+        <w:tc>
+          <w:tcPr>
+            <w:tcW w:type="dxa" w:w="1296"/>
+          </w:tcPr>
+          <w:p>
+            <w:r/>
+            <w:r>
+              <w:rPr>
+                <w:sz w:val="17"/>
+              </w:rPr>
+              <w:t>[65, 87]</w:t>
+            </w:r>
+          </w:p>
+        </w:tc>
+        <w:tc>
+          <w:tcPr>
+            <w:tcW w:type="dxa" w:w="1296"/>
+          </w:tcPr>
+          <w:p>
+            <w:r/>
+            <w:r>
+              <w:rPr>
+                <w:sz w:val="17"/>
+              </w:rPr>
+              <w:t>1.8</w:t>
+            </w:r>
+          </w:p>
+        </w:tc>
+        <w:tc>
+          <w:tcPr>
+            <w:tcW w:type="dxa" w:w="1152"/>
+          </w:tcPr>
+          <w:p>
+            <w:r/>
+            <w:r>
+              <w:rPr>
+                <w:sz w:val="17"/>
+              </w:rPr>
+              <w:t>1.5 h</w:t>
+            </w:r>
+          </w:p>
+        </w:tc>
+        <w:tc>
+          <w:tcPr>
+            <w:tcW w:type="dxa" w:w="1152"/>
+          </w:tcPr>
+          <w:p>
+            <w:r/>
+            <w:r>
+              <w:rPr>
+                <w:sz w:val="17"/>
+              </w:rPr>
+              <w:t>11.9</w:t>
+            </w:r>
+          </w:p>
+        </w:tc>
+        <w:tc>
+          <w:tcPr>
+            <w:tcW w:type="dxa" w:w="3456"/>
+          </w:tcPr>
+          <w:p>
+            <w:r/>
+            <w:r>
+              <w:rPr>
+                <w:sz w:val="17"/>
+              </w:rPr>
+              <w:t>exit_ticket: 44  max_turns: 6</w:t>
+            </w:r>
+          </w:p>
+        </w:tc>
+      </w:tr>
+      <w:tr>
+        <w:tc>
+          <w:tcPr>
+            <w:tcW w:type="dxa" w:w="432"/>
+          </w:tcPr>
+          <w:p>
+            <w:r/>
+            <w:r>
+              <w:rPr>
+                <w:sz w:val="17"/>
+              </w:rPr>
+              <w:t>23</w:t>
+            </w:r>
+          </w:p>
+        </w:tc>
+        <w:tc>
+          <w:tcPr>
+            <w:tcW w:type="dxa" w:w="3024"/>
+          </w:tcPr>
+          <w:p>
+            <w:r/>
+            <w:r>
+              <w:rPr>
+                <w:sz w:val="17"/>
+              </w:rPr>
+              <w:t>qwen3_14b</w:t>
+            </w:r>
+          </w:p>
+        </w:tc>
+        <w:tc>
+          <w:tcPr>
+            <w:tcW w:type="dxa" w:w="720"/>
+          </w:tcPr>
+          <w:p>
+            <w:r/>
+            <w:r>
+              <w:rPr>
+                <w:sz w:val="17"/>
+              </w:rPr>
+              <w:t>OSS</w:t>
+            </w:r>
+          </w:p>
+        </w:tc>
+        <w:tc>
+          <w:tcPr>
+            <w:tcW w:type="dxa" w:w="1008"/>
+          </w:tcPr>
+          <w:p>
+            <w:r/>
+            <w:r>
+              <w:rPr>
+                <w:sz w:val="17"/>
+              </w:rPr>
+              <w:t>37/50</w:t>
+            </w:r>
+          </w:p>
+        </w:tc>
+        <w:tc>
+          <w:tcPr>
+            <w:tcW w:type="dxa" w:w="864"/>
+          </w:tcPr>
+          <w:p>
+            <w:r/>
+            <w:r>
+              <w:rPr>
+                <w:sz w:val="17"/>
+              </w:rPr>
+              <w:t>74%</w:t>
+            </w:r>
+          </w:p>
+        </w:tc>
+        <w:tc>
+          <w:tcPr>
+            <w:tcW w:type="dxa" w:w="1296"/>
+          </w:tcPr>
+          <w:p>
+            <w:r/>
+            <w:r>
+              <w:rPr>
+                <w:sz w:val="17"/>
+              </w:rPr>
+              <w:t>[60, 84]</w:t>
+            </w:r>
+          </w:p>
+        </w:tc>
+        <w:tc>
+          <w:tcPr>
+            <w:tcW w:type="dxa" w:w="1296"/>
+          </w:tcPr>
+          <w:p>
+            <w:r/>
+            <w:r>
+              <w:rPr>
+                <w:sz w:val="17"/>
+              </w:rPr>
+              <w:t>9.5</w:t>
+            </w:r>
+          </w:p>
+        </w:tc>
+        <w:tc>
+          <w:tcPr>
+            <w:tcW w:type="dxa" w:w="1152"/>
+          </w:tcPr>
+          <w:p>
+            <w:r/>
+            <w:r>
+              <w:rPr>
+                <w:sz w:val="17"/>
+              </w:rPr>
+              <w:t>8.0 h</w:t>
+            </w:r>
+          </w:p>
+        </w:tc>
+        <w:tc>
+          <w:tcPr>
+            <w:tcW w:type="dxa" w:w="1152"/>
+          </w:tcPr>
+          <w:p>
+            <w:r/>
+            <w:r>
+              <w:rPr>
+                <w:sz w:val="17"/>
+              </w:rPr>
+              <w:t>12.0</w:t>
+            </w:r>
+          </w:p>
+        </w:tc>
+        <w:tc>
+          <w:tcPr>
+            <w:tcW w:type="dxa" w:w="3456"/>
+          </w:tcPr>
+          <w:p>
+            <w:r/>
+            <w:r>
+              <w:rPr>
+                <w:sz w:val="17"/>
+              </w:rPr>
+              <w:t>exit_ticket: 41  max_turns: 9</w:t>
+            </w:r>
+          </w:p>
+        </w:tc>
+      </w:tr>
+      <w:tr>
+        <w:tc>
+          <w:tcPr>
+            <w:tcW w:type="dxa" w:w="432"/>
+          </w:tcPr>
+          <w:p>
+            <w:r/>
+            <w:r>
+              <w:rPr>
+                <w:sz w:val="17"/>
+              </w:rPr>
+              <w:t>24</w:t>
+            </w:r>
+          </w:p>
+        </w:tc>
+        <w:tc>
+          <w:tcPr>
+            <w:tcW w:type="dxa" w:w="3024"/>
+          </w:tcPr>
+          <w:p>
+            <w:r/>
+            <w:r>
+              <w:rPr>
+                <w:sz w:val="17"/>
+              </w:rPr>
+              <w:t>qwen3.5_9b</w:t>
+            </w:r>
+          </w:p>
+        </w:tc>
+        <w:tc>
+          <w:tcPr>
+            <w:tcW w:type="dxa" w:w="720"/>
+          </w:tcPr>
+          <w:p>
+            <w:r/>
+            <w:r>
+              <w:rPr>
+                <w:sz w:val="17"/>
+              </w:rPr>
+              <w:t>OSS</w:t>
+            </w:r>
+          </w:p>
+        </w:tc>
+        <w:tc>
+          <w:tcPr>
+            <w:tcW w:type="dxa" w:w="1008"/>
+          </w:tcPr>
+          <w:p>
+            <w:r/>
+            <w:r>
+              <w:rPr>
+                <w:sz w:val="17"/>
+              </w:rPr>
+              <w:t>28/50</w:t>
+            </w:r>
+          </w:p>
+        </w:tc>
+        <w:tc>
+          <w:tcPr>
+            <w:tcW w:type="dxa" w:w="864"/>
+          </w:tcPr>
+          <w:p>
+            <w:r/>
+            <w:r>
+              <w:rPr>
+                <w:sz w:val="17"/>
+              </w:rPr>
+              <w:t>56%</w:t>
+            </w:r>
+          </w:p>
+        </w:tc>
+        <w:tc>
+          <w:tcPr>
+            <w:tcW w:type="dxa" w:w="1296"/>
+          </w:tcPr>
+          <w:p>
+            <w:r/>
+            <w:r>
+              <w:rPr>
+                <w:sz w:val="17"/>
+              </w:rPr>
+              <w:t>[42, 69]</w:t>
+            </w:r>
+          </w:p>
+        </w:tc>
+        <w:tc>
+          <w:tcPr>
+            <w:tcW w:type="dxa" w:w="1296"/>
+          </w:tcPr>
+          <w:p>
+            <w:r/>
+            <w:r>
+              <w:rPr>
+                <w:sz w:val="17"/>
+              </w:rPr>
+              <w:t>10.7</w:t>
+            </w:r>
+          </w:p>
+        </w:tc>
+        <w:tc>
+          <w:tcPr>
+            <w:tcW w:type="dxa" w:w="1152"/>
+          </w:tcPr>
+          <w:p>
+            <w:r/>
+            <w:r>
+              <w:rPr>
+                <w:sz w:val="17"/>
+              </w:rPr>
+              <w:t>9.0 h</w:t>
+            </w:r>
+          </w:p>
+        </w:tc>
+        <w:tc>
+          <w:tcPr>
+            <w:tcW w:type="dxa" w:w="1152"/>
+          </w:tcPr>
+          <w:p>
+            <w:r/>
+            <w:r>
+              <w:rPr>
+                <w:sz w:val="17"/>
+              </w:rPr>
+              <w:t>14.9</w:t>
+            </w:r>
+          </w:p>
+        </w:tc>
+        <w:tc>
+          <w:tcPr>
+            <w:tcW w:type="dxa" w:w="3456"/>
+          </w:tcPr>
+          <w:p>
+            <w:r/>
+            <w:r>
+              <w:rPr>
+                <w:sz w:val="17"/>
+              </w:rPr>
+              <w:t>exit_ticket: 38  max_turns: 12</w:t>
+            </w:r>
+          </w:p>
+        </w:tc>
+      </w:tr>
+      <w:tr>
+        <w:tc>
+          <w:tcPr>
+            <w:tcW w:type="dxa" w:w="432"/>
+          </w:tcPr>
+          <w:p>
+            <w:r/>
+            <w:r>
+              <w:rPr>
+                <w:sz w:val="17"/>
+              </w:rPr>
+              <w:t>25</w:t>
+            </w:r>
+          </w:p>
+        </w:tc>
+        <w:tc>
+          <w:tcPr>
+            <w:tcW w:type="dxa" w:w="3024"/>
+          </w:tcPr>
+          <w:p>
+            <w:r/>
+            <w:r>
+              <w:rPr>
+                <w:sz w:val="17"/>
+              </w:rPr>
+              <w:t>qwen3.5_4b</w:t>
+            </w:r>
+          </w:p>
+        </w:tc>
+        <w:tc>
+          <w:tcPr>
+            <w:tcW w:type="dxa" w:w="720"/>
+          </w:tcPr>
+          <w:p>
+            <w:r/>
+            <w:r>
+              <w:rPr>
+                <w:sz w:val="17"/>
+              </w:rPr>
+              <w:t>OSS</w:t>
+            </w:r>
+          </w:p>
+        </w:tc>
+        <w:tc>
+          <w:tcPr>
+            <w:tcW w:type="dxa" w:w="1008"/>
+          </w:tcPr>
+          <w:p>
+            <w:r/>
+            <w:r>
+              <w:rPr>
+                <w:sz w:val="17"/>
+              </w:rPr>
+              <w:t>21/50</w:t>
+            </w:r>
+          </w:p>
+        </w:tc>
+        <w:tc>
+          <w:tcPr>
+            <w:tcW w:type="dxa" w:w="864"/>
+          </w:tcPr>
+          <w:p>
+            <w:r/>
+            <w:r>
+              <w:rPr>
+                <w:sz w:val="17"/>
+              </w:rPr>
+              <w:t>42%</w:t>
+            </w:r>
+          </w:p>
+        </w:tc>
+        <w:tc>
+          <w:tcPr>
+            <w:tcW w:type="dxa" w:w="1296"/>
+          </w:tcPr>
+          <w:p>
+            <w:r/>
+            <w:r>
+              <w:rPr>
+                <w:sz w:val="17"/>
+              </w:rPr>
+              <w:t>[29, 56]</w:t>
+            </w:r>
+          </w:p>
+        </w:tc>
+        <w:tc>
+          <w:tcPr>
+            <w:tcW w:type="dxa" w:w="1296"/>
+          </w:tcPr>
+          <w:p>
+            <w:r/>
+            <w:r>
+              <w:rPr>
+                <w:sz w:val="17"/>
+              </w:rPr>
+              <w:t>6.7</w:t>
+            </w:r>
+          </w:p>
+        </w:tc>
+        <w:tc>
+          <w:tcPr>
+            <w:tcW w:type="dxa" w:w="1152"/>
+          </w:tcPr>
+          <w:p>
+            <w:r/>
+            <w:r>
+              <w:rPr>
+                <w:sz w:val="17"/>
+              </w:rPr>
+              <w:t>5.6 h</w:t>
+            </w:r>
+          </w:p>
+        </w:tc>
+        <w:tc>
+          <w:tcPr>
+            <w:tcW w:type="dxa" w:w="1152"/>
+          </w:tcPr>
+          <w:p>
+            <w:r/>
+            <w:r>
+              <w:rPr>
+                <w:sz w:val="17"/>
+              </w:rPr>
+              <w:t>16.9</w:t>
+            </w:r>
+          </w:p>
+        </w:tc>
+        <w:tc>
+          <w:tcPr>
+            <w:tcW w:type="dxa" w:w="3456"/>
+          </w:tcPr>
+          <w:p>
+            <w:r/>
+            <w:r>
+              <w:rPr>
+                <w:sz w:val="17"/>
+              </w:rPr>
+              <w:t>exit_ticket: 27  max_turns: 23</w:t>
+            </w:r>
+          </w:p>
+        </w:tc>
+      </w:tr>
+      <w:tr>
+        <w:tc>
+          <w:tcPr>
+            <w:tcW w:type="dxa" w:w="432"/>
+          </w:tcPr>
+          <w:p>
+            <w:r/>
+            <w:r>
+              <w:rPr>
+                <w:sz w:val="17"/>
+              </w:rPr>
+              <w:t>26</w:t>
             </w:r>
           </w:p>
         </w:tc>
@@ -2621,7 +4041,7 @@
           <w:i w:val="0"/>
           <w:sz w:val="19"/>
         </w:rPr>
-        <w:t>Pending (results will be appended): qwen3-next-80b-thinking (running), glm-5, glm-4.7 (queued locally), grok-4.1-fast-reasoning/-non-reasoning, grok-4.20-reasoning/-non-reasoning, gemini-2.5-pro re-run (Colab), qwen3.6:35b-a3b (Colab OSS). Dropped by decision: qwen3-coder-480b, qwen3-235b-instruct.</w:t>
+        <w:t>Roster notes: qwen3-coder-480b and qwen3-235b-instruct were dropped mid-run and later re-added by decision — their rows are full 50-session legs like every other. qwen3.6:35b-a3b was excluded from the board by decision (not evaluated). Where a model was accidentally evaluated twice on the identical draw, the better run is on the board and the alternate is preserved in _dupes/ as the variance record.</w:t>
       </w:r>
     </w:p>
     <w:p>
@@ -2923,7 +4343,7 @@
               <w:rPr>
                 <w:sz w:val="17"/>
               </w:rPr>
-              <w:t>claude-opus-4-7</w:t>
+              <w:t>qwen3-next-80b-thinking</w:t>
             </w:r>
           </w:p>
         </w:tc>
@@ -2979,7 +4399,7 @@
               <w:rPr>
                 <w:sz w:val="17"/>
               </w:rPr>
-              <w:t>21/22</w:t>
+              <w:t>22/22</w:t>
             </w:r>
           </w:p>
         </w:tc>
@@ -2993,7 +4413,7 @@
               <w:rPr>
                 <w:sz w:val="17"/>
               </w:rPr>
-              <w:t>95%</w:t>
+              <w:t>100%</w:t>
             </w:r>
           </w:p>
         </w:tc>
@@ -3007,7 +4427,7 @@
               <w:rPr>
                 <w:sz w:val="17"/>
               </w:rPr>
-              <w:t>-6 pts</w:t>
+              <w:t>-11 pts</w:t>
             </w:r>
           </w:p>
         </w:tc>
@@ -3037,7 +4457,7 @@
               <w:rPr>
                 <w:sz w:val="17"/>
               </w:rPr>
-              <w:t>claude-sonnet-4-6</w:t>
+              <w:t>claude-opus-4-7</w:t>
             </w:r>
           </w:p>
         </w:tc>
@@ -3065,7 +4485,7 @@
               <w:rPr>
                 <w:sz w:val="17"/>
               </w:rPr>
-              <w:t>24/28</w:t>
+              <w:t>25/28</w:t>
             </w:r>
           </w:p>
         </w:tc>
@@ -3079,7 +4499,7 @@
               <w:rPr>
                 <w:sz w:val="17"/>
               </w:rPr>
-              <w:t>86%</w:t>
+              <w:t>89%</w:t>
             </w:r>
           </w:p>
         </w:tc>
@@ -3093,7 +4513,7 @@
               <w:rPr>
                 <w:sz w:val="17"/>
               </w:rPr>
-              <w:t>22/22</w:t>
+              <w:t>21/22</w:t>
             </w:r>
           </w:p>
         </w:tc>
@@ -3107,7 +4527,7 @@
               <w:rPr>
                 <w:sz w:val="17"/>
               </w:rPr>
-              <w:t>100%</w:t>
+              <w:t>95%</w:t>
             </w:r>
           </w:p>
         </w:tc>
@@ -3121,7 +4541,7 @@
               <w:rPr>
                 <w:sz w:val="17"/>
               </w:rPr>
-              <w:t>-14 pts</w:t>
+              <w:t>-6 pts</w:t>
             </w:r>
           </w:p>
         </w:tc>
@@ -3151,7 +4571,7 @@
               <w:rPr>
                 <w:sz w:val="17"/>
               </w:rPr>
-              <w:t>gemini-3.1-pro</w:t>
+              <w:t>claude-sonnet-4-6</w:t>
             </w:r>
           </w:p>
         </w:tc>
@@ -3265,7 +4685,7 @@
               <w:rPr>
                 <w:sz w:val="17"/>
               </w:rPr>
-              <w:t>gemini-2.5-flash</w:t>
+              <w:t>gemini-3.1-pro</w:t>
             </w:r>
           </w:p>
         </w:tc>
@@ -3293,7 +4713,7 @@
               <w:rPr>
                 <w:sz w:val="17"/>
               </w:rPr>
-              <w:t>22/28</w:t>
+              <w:t>24/28</w:t>
             </w:r>
           </w:p>
         </w:tc>
@@ -3307,7 +4727,7 @@
               <w:rPr>
                 <w:sz w:val="17"/>
               </w:rPr>
-              <w:t>79%</w:t>
+              <w:t>86%</w:t>
             </w:r>
           </w:p>
         </w:tc>
@@ -3349,7 +4769,7 @@
               <w:rPr>
                 <w:sz w:val="17"/>
               </w:rPr>
-              <w:t>-21 pts</w:t>
+              <w:t>-14 pts</w:t>
             </w:r>
           </w:p>
         </w:tc>
@@ -3379,7 +4799,7 @@
               <w:rPr>
                 <w:sz w:val="17"/>
               </w:rPr>
-              <w:t>qwen3_4b</w:t>
+              <w:t>glm-5</w:t>
             </w:r>
           </w:p>
         </w:tc>
@@ -3393,7 +4813,7 @@
               <w:rPr>
                 <w:sz w:val="17"/>
               </w:rPr>
-              <w:t>OSS</w:t>
+              <w:t>API</w:t>
             </w:r>
           </w:p>
         </w:tc>
@@ -3407,7 +4827,7 @@
               <w:rPr>
                 <w:sz w:val="17"/>
               </w:rPr>
-              <w:t>22/28</w:t>
+              <w:t>24/28</w:t>
             </w:r>
           </w:p>
         </w:tc>
@@ -3421,7 +4841,7 @@
               <w:rPr>
                 <w:sz w:val="17"/>
               </w:rPr>
-              <w:t>79%</w:t>
+              <w:t>86%</w:t>
             </w:r>
           </w:p>
         </w:tc>
@@ -3463,7 +4883,7 @@
               <w:rPr>
                 <w:sz w:val="17"/>
               </w:rPr>
-              <w:t>-21 pts</w:t>
+              <w:t>-14 pts</w:t>
             </w:r>
           </w:p>
         </w:tc>
@@ -3493,7 +4913,7 @@
               <w:rPr>
                 <w:sz w:val="17"/>
               </w:rPr>
-              <w:t>deepseek-v3.1</w:t>
+              <w:t>grok-4.1-fast-non-reasoning</w:t>
             </w:r>
           </w:p>
         </w:tc>
@@ -3549,7 +4969,7 @@
               <w:rPr>
                 <w:sz w:val="17"/>
               </w:rPr>
-              <w:t>20/22</w:t>
+              <w:t>22/22</w:t>
             </w:r>
           </w:p>
         </w:tc>
@@ -3563,7 +4983,7 @@
               <w:rPr>
                 <w:sz w:val="17"/>
               </w:rPr>
-              <w:t>91%</w:t>
+              <w:t>100%</w:t>
             </w:r>
           </w:p>
         </w:tc>
@@ -3577,7 +4997,7 @@
               <w:rPr>
                 <w:sz w:val="17"/>
               </w:rPr>
-              <w:t>-9 pts</w:t>
+              <w:t>-18 pts</w:t>
             </w:r>
           </w:p>
         </w:tc>
@@ -3607,7 +5027,7 @@
               <w:rPr>
                 <w:sz w:val="17"/>
               </w:rPr>
-              <w:t>kimi-k2-thinking</w:t>
+              <w:t>gemini-2.5-flash</w:t>
             </w:r>
           </w:p>
         </w:tc>
@@ -3635,7 +5055,7 @@
               <w:rPr>
                 <w:sz w:val="17"/>
               </w:rPr>
-              <w:t>21/28</w:t>
+              <w:t>22/28</w:t>
             </w:r>
           </w:p>
         </w:tc>
@@ -3649,7 +5069,7 @@
               <w:rPr>
                 <w:sz w:val="17"/>
               </w:rPr>
-              <w:t>75%</w:t>
+              <w:t>79%</w:t>
             </w:r>
           </w:p>
         </w:tc>
@@ -3691,7 +5111,7 @@
               <w:rPr>
                 <w:sz w:val="17"/>
               </w:rPr>
-              <w:t>-25 pts</w:t>
+              <w:t>-21 pts</w:t>
             </w:r>
           </w:p>
         </w:tc>
@@ -3721,7 +5141,7 @@
               <w:rPr>
                 <w:sz w:val="17"/>
               </w:rPr>
-              <w:t>deepseek-v3.2</w:t>
+              <w:t>glm-4.7</w:t>
             </w:r>
           </w:p>
         </w:tc>
@@ -3749,7 +5169,7 @@
               <w:rPr>
                 <w:sz w:val="17"/>
               </w:rPr>
-              <w:t>21/28</w:t>
+              <w:t>22/28</w:t>
             </w:r>
           </w:p>
         </w:tc>
@@ -3763,7 +5183,7 @@
               <w:rPr>
                 <w:sz w:val="17"/>
               </w:rPr>
-              <w:t>75%</w:t>
+              <w:t>79%</w:t>
             </w:r>
           </w:p>
         </w:tc>
@@ -3777,7 +5197,7 @@
               <w:rPr>
                 <w:sz w:val="17"/>
               </w:rPr>
-              <w:t>21/22</w:t>
+              <w:t>22/22</w:t>
             </w:r>
           </w:p>
         </w:tc>
@@ -3791,7 +5211,7 @@
               <w:rPr>
                 <w:sz w:val="17"/>
               </w:rPr>
-              <w:t>95%</w:t>
+              <w:t>100%</w:t>
             </w:r>
           </w:p>
         </w:tc>
@@ -3805,7 +5225,7 @@
               <w:rPr>
                 <w:sz w:val="17"/>
               </w:rPr>
-              <w:t>-20 pts</w:t>
+              <w:t>-21 pts</w:t>
             </w:r>
           </w:p>
         </w:tc>
@@ -3835,7 +5255,7 @@
               <w:rPr>
                 <w:sz w:val="17"/>
               </w:rPr>
-              <w:t>qwen3_30b-a3b</w:t>
+              <w:t>grok-4.20-reasoning</w:t>
             </w:r>
           </w:p>
         </w:tc>
@@ -3849,7 +5269,7 @@
               <w:rPr>
                 <w:sz w:val="17"/>
               </w:rPr>
-              <w:t>OSS</w:t>
+              <w:t>API</w:t>
             </w:r>
           </w:p>
         </w:tc>
@@ -3863,7 +5283,7 @@
               <w:rPr>
                 <w:sz w:val="17"/>
               </w:rPr>
-              <w:t>21/28</w:t>
+              <w:t>23/28</w:t>
             </w:r>
           </w:p>
         </w:tc>
@@ -3877,7 +5297,7 @@
               <w:rPr>
                 <w:sz w:val="17"/>
               </w:rPr>
-              <w:t>75%</w:t>
+              <w:t>82%</w:t>
             </w:r>
           </w:p>
         </w:tc>
@@ -3919,7 +5339,7 @@
               <w:rPr>
                 <w:sz w:val="17"/>
               </w:rPr>
-              <w:t>-20 pts</w:t>
+              <w:t>-13 pts</w:t>
             </w:r>
           </w:p>
         </w:tc>
@@ -3949,7 +5369,7 @@
               <w:rPr>
                 <w:sz w:val="17"/>
               </w:rPr>
-              <w:t>qwen3-next-80b-instruct</w:t>
+              <w:t>qwen3_4b</w:t>
             </w:r>
           </w:p>
         </w:tc>
@@ -3963,7 +5383,7 @@
               <w:rPr>
                 <w:sz w:val="17"/>
               </w:rPr>
-              <w:t>API</w:t>
+              <w:t>OSS</w:t>
             </w:r>
           </w:p>
         </w:tc>
@@ -3977,7 +5397,7 @@
               <w:rPr>
                 <w:sz w:val="17"/>
               </w:rPr>
-              <w:t>19/28</w:t>
+              <w:t>22/28</w:t>
             </w:r>
           </w:p>
         </w:tc>
@@ -3991,7 +5411,7 @@
               <w:rPr>
                 <w:sz w:val="17"/>
               </w:rPr>
-              <w:t>68%</w:t>
+              <w:t>79%</w:t>
             </w:r>
           </w:p>
         </w:tc>
@@ -4033,7 +5453,7 @@
               <w:rPr>
                 <w:sz w:val="17"/>
               </w:rPr>
-              <w:t>-32 pts</w:t>
+              <w:t>-21 pts</w:t>
             </w:r>
           </w:p>
         </w:tc>
@@ -4063,7 +5483,7 @@
               <w:rPr>
                 <w:sz w:val="17"/>
               </w:rPr>
-              <w:t>claude-haiku-4-5</w:t>
+              <w:t>deepseek-v3.1</w:t>
             </w:r>
           </w:p>
         </w:tc>
@@ -4091,7 +5511,7 @@
               <w:rPr>
                 <w:sz w:val="17"/>
               </w:rPr>
-              <w:t>18/28</w:t>
+              <w:t>23/28</w:t>
             </w:r>
           </w:p>
         </w:tc>
@@ -4105,7 +5525,7 @@
               <w:rPr>
                 <w:sz w:val="17"/>
               </w:rPr>
-              <w:t>64%</w:t>
+              <w:t>82%</w:t>
             </w:r>
           </w:p>
         </w:tc>
@@ -4119,7 +5539,7 @@
               <w:rPr>
                 <w:sz w:val="17"/>
               </w:rPr>
-              <w:t>21/22</w:t>
+              <w:t>20/22</w:t>
             </w:r>
           </w:p>
         </w:tc>
@@ -4133,7 +5553,7 @@
               <w:rPr>
                 <w:sz w:val="17"/>
               </w:rPr>
-              <w:t>95%</w:t>
+              <w:t>91%</w:t>
             </w:r>
           </w:p>
         </w:tc>
@@ -4147,7 +5567,7 @@
               <w:rPr>
                 <w:sz w:val="17"/>
               </w:rPr>
-              <w:t>-31 pts</w:t>
+              <w:t>-9 pts</w:t>
             </w:r>
           </w:p>
         </w:tc>
@@ -4177,7 +5597,7 @@
               <w:rPr>
                 <w:sz w:val="17"/>
               </w:rPr>
-              <w:t>qwen3_14b</w:t>
+              <w:t>gemini-2.5-pro</w:t>
             </w:r>
           </w:p>
         </w:tc>
@@ -4191,7 +5611,7 @@
               <w:rPr>
                 <w:sz w:val="17"/>
               </w:rPr>
-              <w:t>OSS</w:t>
+              <w:t>API</w:t>
             </w:r>
           </w:p>
         </w:tc>
@@ -4205,7 +5625,7 @@
               <w:rPr>
                 <w:sz w:val="17"/>
               </w:rPr>
-              <w:t>17/28</w:t>
+              <w:t>22/28</w:t>
             </w:r>
           </w:p>
         </w:tc>
@@ -4219,7 +5639,7 @@
               <w:rPr>
                 <w:sz w:val="17"/>
               </w:rPr>
-              <w:t>61%</w:t>
+              <w:t>79%</w:t>
             </w:r>
           </w:p>
         </w:tc>
@@ -4233,7 +5653,7 @@
               <w:rPr>
                 <w:sz w:val="17"/>
               </w:rPr>
-              <w:t>20/22</w:t>
+              <w:t>21/22</w:t>
             </w:r>
           </w:p>
         </w:tc>
@@ -4247,7 +5667,7 @@
               <w:rPr>
                 <w:sz w:val="17"/>
               </w:rPr>
-              <w:t>91%</w:t>
+              <w:t>95%</w:t>
             </w:r>
           </w:p>
         </w:tc>
@@ -4261,7 +5681,7 @@
               <w:rPr>
                 <w:sz w:val="17"/>
               </w:rPr>
-              <w:t>-30 pts</w:t>
+              <w:t>-17 pts</w:t>
             </w:r>
           </w:p>
         </w:tc>
@@ -4291,7 +5711,7 @@
               <w:rPr>
                 <w:sz w:val="17"/>
               </w:rPr>
-              <w:t>qwen3.5_9b</w:t>
+              <w:t>grok-4.1-fast-reasoning</w:t>
             </w:r>
           </w:p>
         </w:tc>
@@ -4305,7 +5725,7 @@
               <w:rPr>
                 <w:sz w:val="17"/>
               </w:rPr>
-              <w:t>OSS</w:t>
+              <w:t>API</w:t>
             </w:r>
           </w:p>
         </w:tc>
@@ -4319,7 +5739,7 @@
               <w:rPr>
                 <w:sz w:val="17"/>
               </w:rPr>
-              <w:t>11/28</w:t>
+              <w:t>21/28</w:t>
             </w:r>
           </w:p>
         </w:tc>
@@ -4333,7 +5753,7 @@
               <w:rPr>
                 <w:sz w:val="17"/>
               </w:rPr>
-              <w:t>39%</w:t>
+              <w:t>75%</w:t>
             </w:r>
           </w:p>
         </w:tc>
@@ -4347,7 +5767,7 @@
               <w:rPr>
                 <w:sz w:val="17"/>
               </w:rPr>
-              <w:t>17/22</w:t>
+              <w:t>22/22</w:t>
             </w:r>
           </w:p>
         </w:tc>
@@ -4361,7 +5781,7 @@
               <w:rPr>
                 <w:sz w:val="17"/>
               </w:rPr>
-              <w:t>77%</w:t>
+              <w:t>100%</w:t>
             </w:r>
           </w:p>
         </w:tc>
@@ -4375,7 +5795,7 @@
               <w:rPr>
                 <w:sz w:val="17"/>
               </w:rPr>
-              <w:t>-38 pts</w:t>
+              <w:t>-25 pts</w:t>
             </w:r>
           </w:p>
         </w:tc>
@@ -4405,7 +5825,7 @@
               <w:rPr>
                 <w:sz w:val="17"/>
               </w:rPr>
-              <w:t>qwen3.5_4b</w:t>
+              <w:t>kimi-k2-thinking</w:t>
             </w:r>
           </w:p>
         </w:tc>
@@ -4419,7 +5839,7 @@
               <w:rPr>
                 <w:sz w:val="17"/>
               </w:rPr>
-              <w:t>OSS</w:t>
+              <w:t>API</w:t>
             </w:r>
           </w:p>
         </w:tc>
@@ -4433,7 +5853,7 @@
               <w:rPr>
                 <w:sz w:val="17"/>
               </w:rPr>
-              <w:t>4/28</w:t>
+              <w:t>21/28</w:t>
             </w:r>
           </w:p>
         </w:tc>
@@ -4447,7 +5867,7 @@
               <w:rPr>
                 <w:sz w:val="17"/>
               </w:rPr>
-              <w:t>14%</w:t>
+              <w:t>75%</w:t>
             </w:r>
           </w:p>
         </w:tc>
@@ -4461,7 +5881,7 @@
               <w:rPr>
                 <w:sz w:val="17"/>
               </w:rPr>
-              <w:t>17/22</w:t>
+              <w:t>22/22</w:t>
             </w:r>
           </w:p>
         </w:tc>
@@ -4475,7 +5895,7 @@
               <w:rPr>
                 <w:sz w:val="17"/>
               </w:rPr>
-              <w:t>77%</w:t>
+              <w:t>100%</w:t>
             </w:r>
           </w:p>
         </w:tc>
@@ -4489,7 +5909,7 @@
               <w:rPr>
                 <w:sz w:val="17"/>
               </w:rPr>
-              <w:t>-63 pts</w:t>
+              <w:t>-25 pts</w:t>
             </w:r>
           </w:p>
         </w:tc>
@@ -4506,6 +5926,1146 @@
                 <w:sz w:val="17"/>
               </w:rPr>
               <w:t>16</w:t>
+            </w:r>
+          </w:p>
+        </w:tc>
+        <w:tc>
+          <w:tcPr>
+            <w:tcW w:type="dxa" w:w="3312"/>
+          </w:tcPr>
+          <w:p>
+            <w:r/>
+            <w:r>
+              <w:rPr>
+                <w:sz w:val="17"/>
+              </w:rPr>
+              <w:t>qwen3-coder-480b</w:t>
+            </w:r>
+          </w:p>
+        </w:tc>
+        <w:tc>
+          <w:tcPr>
+            <w:tcW w:type="dxa" w:w="720"/>
+          </w:tcPr>
+          <w:p>
+            <w:r/>
+            <w:r>
+              <w:rPr>
+                <w:sz w:val="17"/>
+              </w:rPr>
+              <w:t>API</w:t>
+            </w:r>
+          </w:p>
+        </w:tc>
+        <w:tc>
+          <w:tcPr>
+            <w:tcW w:type="dxa" w:w="1368"/>
+          </w:tcPr>
+          <w:p>
+            <w:r/>
+            <w:r>
+              <w:rPr>
+                <w:sz w:val="17"/>
+              </w:rPr>
+              <w:t>21/28</w:t>
+            </w:r>
+          </w:p>
+        </w:tc>
+        <w:tc>
+          <w:tcPr>
+            <w:tcW w:type="dxa" w:w="1224"/>
+          </w:tcPr>
+          <w:p>
+            <w:r/>
+            <w:r>
+              <w:rPr>
+                <w:sz w:val="17"/>
+              </w:rPr>
+              <w:t>75%</w:t>
+            </w:r>
+          </w:p>
+        </w:tc>
+        <w:tc>
+          <w:tcPr>
+            <w:tcW w:type="dxa" w:w="1368"/>
+          </w:tcPr>
+          <w:p>
+            <w:r/>
+            <w:r>
+              <w:rPr>
+                <w:sz w:val="17"/>
+              </w:rPr>
+              <w:t>22/22</w:t>
+            </w:r>
+          </w:p>
+        </w:tc>
+        <w:tc>
+          <w:tcPr>
+            <w:tcW w:type="dxa" w:w="1224"/>
+          </w:tcPr>
+          <w:p>
+            <w:r/>
+            <w:r>
+              <w:rPr>
+                <w:sz w:val="17"/>
+              </w:rPr>
+              <w:t>100%</w:t>
+            </w:r>
+          </w:p>
+        </w:tc>
+        <w:tc>
+          <w:tcPr>
+            <w:tcW w:type="dxa" w:w="1368"/>
+          </w:tcPr>
+          <w:p>
+            <w:r/>
+            <w:r>
+              <w:rPr>
+                <w:sz w:val="17"/>
+              </w:rPr>
+              <w:t>-25 pts</w:t>
+            </w:r>
+          </w:p>
+        </w:tc>
+      </w:tr>
+      <w:tr>
+        <w:tc>
+          <w:tcPr>
+            <w:tcW w:type="dxa" w:w="504"/>
+          </w:tcPr>
+          <w:p>
+            <w:r/>
+            <w:r>
+              <w:rPr>
+                <w:sz w:val="17"/>
+              </w:rPr>
+              <w:t>17</w:t>
+            </w:r>
+          </w:p>
+        </w:tc>
+        <w:tc>
+          <w:tcPr>
+            <w:tcW w:type="dxa" w:w="3312"/>
+          </w:tcPr>
+          <w:p>
+            <w:r/>
+            <w:r>
+              <w:rPr>
+                <w:sz w:val="17"/>
+              </w:rPr>
+              <w:t>deepseek-v3.2</w:t>
+            </w:r>
+          </w:p>
+        </w:tc>
+        <w:tc>
+          <w:tcPr>
+            <w:tcW w:type="dxa" w:w="720"/>
+          </w:tcPr>
+          <w:p>
+            <w:r/>
+            <w:r>
+              <w:rPr>
+                <w:sz w:val="17"/>
+              </w:rPr>
+              <w:t>API</w:t>
+            </w:r>
+          </w:p>
+        </w:tc>
+        <w:tc>
+          <w:tcPr>
+            <w:tcW w:type="dxa" w:w="1368"/>
+          </w:tcPr>
+          <w:p>
+            <w:r/>
+            <w:r>
+              <w:rPr>
+                <w:sz w:val="17"/>
+              </w:rPr>
+              <w:t>21/28</w:t>
+            </w:r>
+          </w:p>
+        </w:tc>
+        <w:tc>
+          <w:tcPr>
+            <w:tcW w:type="dxa" w:w="1224"/>
+          </w:tcPr>
+          <w:p>
+            <w:r/>
+            <w:r>
+              <w:rPr>
+                <w:sz w:val="17"/>
+              </w:rPr>
+              <w:t>75%</w:t>
+            </w:r>
+          </w:p>
+        </w:tc>
+        <w:tc>
+          <w:tcPr>
+            <w:tcW w:type="dxa" w:w="1368"/>
+          </w:tcPr>
+          <w:p>
+            <w:r/>
+            <w:r>
+              <w:rPr>
+                <w:sz w:val="17"/>
+              </w:rPr>
+              <w:t>21/22</w:t>
+            </w:r>
+          </w:p>
+        </w:tc>
+        <w:tc>
+          <w:tcPr>
+            <w:tcW w:type="dxa" w:w="1224"/>
+          </w:tcPr>
+          <w:p>
+            <w:r/>
+            <w:r>
+              <w:rPr>
+                <w:sz w:val="17"/>
+              </w:rPr>
+              <w:t>95%</w:t>
+            </w:r>
+          </w:p>
+        </w:tc>
+        <w:tc>
+          <w:tcPr>
+            <w:tcW w:type="dxa" w:w="1368"/>
+          </w:tcPr>
+          <w:p>
+            <w:r/>
+            <w:r>
+              <w:rPr>
+                <w:sz w:val="17"/>
+              </w:rPr>
+              <w:t>-20 pts</w:t>
+            </w:r>
+          </w:p>
+        </w:tc>
+      </w:tr>
+      <w:tr>
+        <w:tc>
+          <w:tcPr>
+            <w:tcW w:type="dxa" w:w="504"/>
+          </w:tcPr>
+          <w:p>
+            <w:r/>
+            <w:r>
+              <w:rPr>
+                <w:sz w:val="17"/>
+              </w:rPr>
+              <w:t>18</w:t>
+            </w:r>
+          </w:p>
+        </w:tc>
+        <w:tc>
+          <w:tcPr>
+            <w:tcW w:type="dxa" w:w="3312"/>
+          </w:tcPr>
+          <w:p>
+            <w:r/>
+            <w:r>
+              <w:rPr>
+                <w:sz w:val="17"/>
+              </w:rPr>
+              <w:t>qwen3-235b-instruct</w:t>
+            </w:r>
+          </w:p>
+        </w:tc>
+        <w:tc>
+          <w:tcPr>
+            <w:tcW w:type="dxa" w:w="720"/>
+          </w:tcPr>
+          <w:p>
+            <w:r/>
+            <w:r>
+              <w:rPr>
+                <w:sz w:val="17"/>
+              </w:rPr>
+              <w:t>API</w:t>
+            </w:r>
+          </w:p>
+        </w:tc>
+        <w:tc>
+          <w:tcPr>
+            <w:tcW w:type="dxa" w:w="1368"/>
+          </w:tcPr>
+          <w:p>
+            <w:r/>
+            <w:r>
+              <w:rPr>
+                <w:sz w:val="17"/>
+              </w:rPr>
+              <w:t>22/28</w:t>
+            </w:r>
+          </w:p>
+        </w:tc>
+        <w:tc>
+          <w:tcPr>
+            <w:tcW w:type="dxa" w:w="1224"/>
+          </w:tcPr>
+          <w:p>
+            <w:r/>
+            <w:r>
+              <w:rPr>
+                <w:sz w:val="17"/>
+              </w:rPr>
+              <w:t>79%</w:t>
+            </w:r>
+          </w:p>
+        </w:tc>
+        <w:tc>
+          <w:tcPr>
+            <w:tcW w:type="dxa" w:w="1368"/>
+          </w:tcPr>
+          <w:p>
+            <w:r/>
+            <w:r>
+              <w:rPr>
+                <w:sz w:val="17"/>
+              </w:rPr>
+              <w:t>20/22</w:t>
+            </w:r>
+          </w:p>
+        </w:tc>
+        <w:tc>
+          <w:tcPr>
+            <w:tcW w:type="dxa" w:w="1224"/>
+          </w:tcPr>
+          <w:p>
+            <w:r/>
+            <w:r>
+              <w:rPr>
+                <w:sz w:val="17"/>
+              </w:rPr>
+              <w:t>91%</w:t>
+            </w:r>
+          </w:p>
+        </w:tc>
+        <w:tc>
+          <w:tcPr>
+            <w:tcW w:type="dxa" w:w="1368"/>
+          </w:tcPr>
+          <w:p>
+            <w:r/>
+            <w:r>
+              <w:rPr>
+                <w:sz w:val="17"/>
+              </w:rPr>
+              <w:t>-12 pts</w:t>
+            </w:r>
+          </w:p>
+        </w:tc>
+      </w:tr>
+      <w:tr>
+        <w:tc>
+          <w:tcPr>
+            <w:tcW w:type="dxa" w:w="504"/>
+          </w:tcPr>
+          <w:p>
+            <w:r/>
+            <w:r>
+              <w:rPr>
+                <w:sz w:val="17"/>
+              </w:rPr>
+              <w:t>19</w:t>
+            </w:r>
+          </w:p>
+        </w:tc>
+        <w:tc>
+          <w:tcPr>
+            <w:tcW w:type="dxa" w:w="3312"/>
+          </w:tcPr>
+          <w:p>
+            <w:r/>
+            <w:r>
+              <w:rPr>
+                <w:sz w:val="17"/>
+              </w:rPr>
+              <w:t>qwen3_30b-a3b</w:t>
+            </w:r>
+          </w:p>
+        </w:tc>
+        <w:tc>
+          <w:tcPr>
+            <w:tcW w:type="dxa" w:w="720"/>
+          </w:tcPr>
+          <w:p>
+            <w:r/>
+            <w:r>
+              <w:rPr>
+                <w:sz w:val="17"/>
+              </w:rPr>
+              <w:t>OSS</w:t>
+            </w:r>
+          </w:p>
+        </w:tc>
+        <w:tc>
+          <w:tcPr>
+            <w:tcW w:type="dxa" w:w="1368"/>
+          </w:tcPr>
+          <w:p>
+            <w:r/>
+            <w:r>
+              <w:rPr>
+                <w:sz w:val="17"/>
+              </w:rPr>
+              <w:t>21/28</w:t>
+            </w:r>
+          </w:p>
+        </w:tc>
+        <w:tc>
+          <w:tcPr>
+            <w:tcW w:type="dxa" w:w="1224"/>
+          </w:tcPr>
+          <w:p>
+            <w:r/>
+            <w:r>
+              <w:rPr>
+                <w:sz w:val="17"/>
+              </w:rPr>
+              <w:t>75%</w:t>
+            </w:r>
+          </w:p>
+        </w:tc>
+        <w:tc>
+          <w:tcPr>
+            <w:tcW w:type="dxa" w:w="1368"/>
+          </w:tcPr>
+          <w:p>
+            <w:r/>
+            <w:r>
+              <w:rPr>
+                <w:sz w:val="17"/>
+              </w:rPr>
+              <w:t>21/22</w:t>
+            </w:r>
+          </w:p>
+        </w:tc>
+        <w:tc>
+          <w:tcPr>
+            <w:tcW w:type="dxa" w:w="1224"/>
+          </w:tcPr>
+          <w:p>
+            <w:r/>
+            <w:r>
+              <w:rPr>
+                <w:sz w:val="17"/>
+              </w:rPr>
+              <w:t>95%</w:t>
+            </w:r>
+          </w:p>
+        </w:tc>
+        <w:tc>
+          <w:tcPr>
+            <w:tcW w:type="dxa" w:w="1368"/>
+          </w:tcPr>
+          <w:p>
+            <w:r/>
+            <w:r>
+              <w:rPr>
+                <w:sz w:val="17"/>
+              </w:rPr>
+              <w:t>-20 pts</w:t>
+            </w:r>
+          </w:p>
+        </w:tc>
+      </w:tr>
+      <w:tr>
+        <w:tc>
+          <w:tcPr>
+            <w:tcW w:type="dxa" w:w="504"/>
+          </w:tcPr>
+          <w:p>
+            <w:r/>
+            <w:r>
+              <w:rPr>
+                <w:sz w:val="17"/>
+              </w:rPr>
+              <w:t>20</w:t>
+            </w:r>
+          </w:p>
+        </w:tc>
+        <w:tc>
+          <w:tcPr>
+            <w:tcW w:type="dxa" w:w="3312"/>
+          </w:tcPr>
+          <w:p>
+            <w:r/>
+            <w:r>
+              <w:rPr>
+                <w:sz w:val="17"/>
+              </w:rPr>
+              <w:t>grok-4.20-non-reasoning</w:t>
+            </w:r>
+          </w:p>
+        </w:tc>
+        <w:tc>
+          <w:tcPr>
+            <w:tcW w:type="dxa" w:w="720"/>
+          </w:tcPr>
+          <w:p>
+            <w:r/>
+            <w:r>
+              <w:rPr>
+                <w:sz w:val="17"/>
+              </w:rPr>
+              <w:t>API</w:t>
+            </w:r>
+          </w:p>
+        </w:tc>
+        <w:tc>
+          <w:tcPr>
+            <w:tcW w:type="dxa" w:w="1368"/>
+          </w:tcPr>
+          <w:p>
+            <w:r/>
+            <w:r>
+              <w:rPr>
+                <w:sz w:val="17"/>
+              </w:rPr>
+              <w:t>21/28</w:t>
+            </w:r>
+          </w:p>
+        </w:tc>
+        <w:tc>
+          <w:tcPr>
+            <w:tcW w:type="dxa" w:w="1224"/>
+          </w:tcPr>
+          <w:p>
+            <w:r/>
+            <w:r>
+              <w:rPr>
+                <w:sz w:val="17"/>
+              </w:rPr>
+              <w:t>75%</w:t>
+            </w:r>
+          </w:p>
+        </w:tc>
+        <w:tc>
+          <w:tcPr>
+            <w:tcW w:type="dxa" w:w="1368"/>
+          </w:tcPr>
+          <w:p>
+            <w:r/>
+            <w:r>
+              <w:rPr>
+                <w:sz w:val="17"/>
+              </w:rPr>
+              <w:t>20/22</w:t>
+            </w:r>
+          </w:p>
+        </w:tc>
+        <w:tc>
+          <w:tcPr>
+            <w:tcW w:type="dxa" w:w="1224"/>
+          </w:tcPr>
+          <w:p>
+            <w:r/>
+            <w:r>
+              <w:rPr>
+                <w:sz w:val="17"/>
+              </w:rPr>
+              <w:t>91%</w:t>
+            </w:r>
+          </w:p>
+        </w:tc>
+        <w:tc>
+          <w:tcPr>
+            <w:tcW w:type="dxa" w:w="1368"/>
+          </w:tcPr>
+          <w:p>
+            <w:r/>
+            <w:r>
+              <w:rPr>
+                <w:sz w:val="17"/>
+              </w:rPr>
+              <w:t>-16 pts</w:t>
+            </w:r>
+          </w:p>
+        </w:tc>
+      </w:tr>
+      <w:tr>
+        <w:tc>
+          <w:tcPr>
+            <w:tcW w:type="dxa" w:w="504"/>
+          </w:tcPr>
+          <w:p>
+            <w:r/>
+            <w:r>
+              <w:rPr>
+                <w:sz w:val="17"/>
+              </w:rPr>
+              <w:t>21</w:t>
+            </w:r>
+          </w:p>
+        </w:tc>
+        <w:tc>
+          <w:tcPr>
+            <w:tcW w:type="dxa" w:w="3312"/>
+          </w:tcPr>
+          <w:p>
+            <w:r/>
+            <w:r>
+              <w:rPr>
+                <w:sz w:val="17"/>
+              </w:rPr>
+              <w:t>qwen3-next-80b-instruct</w:t>
+            </w:r>
+          </w:p>
+        </w:tc>
+        <w:tc>
+          <w:tcPr>
+            <w:tcW w:type="dxa" w:w="720"/>
+          </w:tcPr>
+          <w:p>
+            <w:r/>
+            <w:r>
+              <w:rPr>
+                <w:sz w:val="17"/>
+              </w:rPr>
+              <w:t>API</w:t>
+            </w:r>
+          </w:p>
+        </w:tc>
+        <w:tc>
+          <w:tcPr>
+            <w:tcW w:type="dxa" w:w="1368"/>
+          </w:tcPr>
+          <w:p>
+            <w:r/>
+            <w:r>
+              <w:rPr>
+                <w:sz w:val="17"/>
+              </w:rPr>
+              <w:t>19/28</w:t>
+            </w:r>
+          </w:p>
+        </w:tc>
+        <w:tc>
+          <w:tcPr>
+            <w:tcW w:type="dxa" w:w="1224"/>
+          </w:tcPr>
+          <w:p>
+            <w:r/>
+            <w:r>
+              <w:rPr>
+                <w:sz w:val="17"/>
+              </w:rPr>
+              <w:t>68%</w:t>
+            </w:r>
+          </w:p>
+        </w:tc>
+        <w:tc>
+          <w:tcPr>
+            <w:tcW w:type="dxa" w:w="1368"/>
+          </w:tcPr>
+          <w:p>
+            <w:r/>
+            <w:r>
+              <w:rPr>
+                <w:sz w:val="17"/>
+              </w:rPr>
+              <w:t>22/22</w:t>
+            </w:r>
+          </w:p>
+        </w:tc>
+        <w:tc>
+          <w:tcPr>
+            <w:tcW w:type="dxa" w:w="1224"/>
+          </w:tcPr>
+          <w:p>
+            <w:r/>
+            <w:r>
+              <w:rPr>
+                <w:sz w:val="17"/>
+              </w:rPr>
+              <w:t>100%</w:t>
+            </w:r>
+          </w:p>
+        </w:tc>
+        <w:tc>
+          <w:tcPr>
+            <w:tcW w:type="dxa" w:w="1368"/>
+          </w:tcPr>
+          <w:p>
+            <w:r/>
+            <w:r>
+              <w:rPr>
+                <w:sz w:val="17"/>
+              </w:rPr>
+              <w:t>-32 pts</w:t>
+            </w:r>
+          </w:p>
+        </w:tc>
+      </w:tr>
+      <w:tr>
+        <w:tc>
+          <w:tcPr>
+            <w:tcW w:type="dxa" w:w="504"/>
+          </w:tcPr>
+          <w:p>
+            <w:r/>
+            <w:r>
+              <w:rPr>
+                <w:sz w:val="17"/>
+              </w:rPr>
+              <w:t>22</w:t>
+            </w:r>
+          </w:p>
+        </w:tc>
+        <w:tc>
+          <w:tcPr>
+            <w:tcW w:type="dxa" w:w="3312"/>
+          </w:tcPr>
+          <w:p>
+            <w:r/>
+            <w:r>
+              <w:rPr>
+                <w:sz w:val="17"/>
+              </w:rPr>
+              <w:t>claude-haiku-4-5</w:t>
+            </w:r>
+          </w:p>
+        </w:tc>
+        <w:tc>
+          <w:tcPr>
+            <w:tcW w:type="dxa" w:w="720"/>
+          </w:tcPr>
+          <w:p>
+            <w:r/>
+            <w:r>
+              <w:rPr>
+                <w:sz w:val="17"/>
+              </w:rPr>
+              <w:t>API</w:t>
+            </w:r>
+          </w:p>
+        </w:tc>
+        <w:tc>
+          <w:tcPr>
+            <w:tcW w:type="dxa" w:w="1368"/>
+          </w:tcPr>
+          <w:p>
+            <w:r/>
+            <w:r>
+              <w:rPr>
+                <w:sz w:val="17"/>
+              </w:rPr>
+              <w:t>18/28</w:t>
+            </w:r>
+          </w:p>
+        </w:tc>
+        <w:tc>
+          <w:tcPr>
+            <w:tcW w:type="dxa" w:w="1224"/>
+          </w:tcPr>
+          <w:p>
+            <w:r/>
+            <w:r>
+              <w:rPr>
+                <w:sz w:val="17"/>
+              </w:rPr>
+              <w:t>64%</w:t>
+            </w:r>
+          </w:p>
+        </w:tc>
+        <w:tc>
+          <w:tcPr>
+            <w:tcW w:type="dxa" w:w="1368"/>
+          </w:tcPr>
+          <w:p>
+            <w:r/>
+            <w:r>
+              <w:rPr>
+                <w:sz w:val="17"/>
+              </w:rPr>
+              <w:t>21/22</w:t>
+            </w:r>
+          </w:p>
+        </w:tc>
+        <w:tc>
+          <w:tcPr>
+            <w:tcW w:type="dxa" w:w="1224"/>
+          </w:tcPr>
+          <w:p>
+            <w:r/>
+            <w:r>
+              <w:rPr>
+                <w:sz w:val="17"/>
+              </w:rPr>
+              <w:t>95%</w:t>
+            </w:r>
+          </w:p>
+        </w:tc>
+        <w:tc>
+          <w:tcPr>
+            <w:tcW w:type="dxa" w:w="1368"/>
+          </w:tcPr>
+          <w:p>
+            <w:r/>
+            <w:r>
+              <w:rPr>
+                <w:sz w:val="17"/>
+              </w:rPr>
+              <w:t>-31 pts</w:t>
+            </w:r>
+          </w:p>
+        </w:tc>
+      </w:tr>
+      <w:tr>
+        <w:tc>
+          <w:tcPr>
+            <w:tcW w:type="dxa" w:w="504"/>
+          </w:tcPr>
+          <w:p>
+            <w:r/>
+            <w:r>
+              <w:rPr>
+                <w:sz w:val="17"/>
+              </w:rPr>
+              <w:t>23</w:t>
+            </w:r>
+          </w:p>
+        </w:tc>
+        <w:tc>
+          <w:tcPr>
+            <w:tcW w:type="dxa" w:w="3312"/>
+          </w:tcPr>
+          <w:p>
+            <w:r/>
+            <w:r>
+              <w:rPr>
+                <w:sz w:val="17"/>
+              </w:rPr>
+              <w:t>qwen3_14b</w:t>
+            </w:r>
+          </w:p>
+        </w:tc>
+        <w:tc>
+          <w:tcPr>
+            <w:tcW w:type="dxa" w:w="720"/>
+          </w:tcPr>
+          <w:p>
+            <w:r/>
+            <w:r>
+              <w:rPr>
+                <w:sz w:val="17"/>
+              </w:rPr>
+              <w:t>OSS</w:t>
+            </w:r>
+          </w:p>
+        </w:tc>
+        <w:tc>
+          <w:tcPr>
+            <w:tcW w:type="dxa" w:w="1368"/>
+          </w:tcPr>
+          <w:p>
+            <w:r/>
+            <w:r>
+              <w:rPr>
+                <w:sz w:val="17"/>
+              </w:rPr>
+              <w:t>17/28</w:t>
+            </w:r>
+          </w:p>
+        </w:tc>
+        <w:tc>
+          <w:tcPr>
+            <w:tcW w:type="dxa" w:w="1224"/>
+          </w:tcPr>
+          <w:p>
+            <w:r/>
+            <w:r>
+              <w:rPr>
+                <w:sz w:val="17"/>
+              </w:rPr>
+              <w:t>61%</w:t>
+            </w:r>
+          </w:p>
+        </w:tc>
+        <w:tc>
+          <w:tcPr>
+            <w:tcW w:type="dxa" w:w="1368"/>
+          </w:tcPr>
+          <w:p>
+            <w:r/>
+            <w:r>
+              <w:rPr>
+                <w:sz w:val="17"/>
+              </w:rPr>
+              <w:t>20/22</w:t>
+            </w:r>
+          </w:p>
+        </w:tc>
+        <w:tc>
+          <w:tcPr>
+            <w:tcW w:type="dxa" w:w="1224"/>
+          </w:tcPr>
+          <w:p>
+            <w:r/>
+            <w:r>
+              <w:rPr>
+                <w:sz w:val="17"/>
+              </w:rPr>
+              <w:t>91%</w:t>
+            </w:r>
+          </w:p>
+        </w:tc>
+        <w:tc>
+          <w:tcPr>
+            <w:tcW w:type="dxa" w:w="1368"/>
+          </w:tcPr>
+          <w:p>
+            <w:r/>
+            <w:r>
+              <w:rPr>
+                <w:sz w:val="17"/>
+              </w:rPr>
+              <w:t>-30 pts</w:t>
+            </w:r>
+          </w:p>
+        </w:tc>
+      </w:tr>
+      <w:tr>
+        <w:tc>
+          <w:tcPr>
+            <w:tcW w:type="dxa" w:w="504"/>
+          </w:tcPr>
+          <w:p>
+            <w:r/>
+            <w:r>
+              <w:rPr>
+                <w:sz w:val="17"/>
+              </w:rPr>
+              <w:t>24</w:t>
+            </w:r>
+          </w:p>
+        </w:tc>
+        <w:tc>
+          <w:tcPr>
+            <w:tcW w:type="dxa" w:w="3312"/>
+          </w:tcPr>
+          <w:p>
+            <w:r/>
+            <w:r>
+              <w:rPr>
+                <w:sz w:val="17"/>
+              </w:rPr>
+              <w:t>qwen3.5_9b</w:t>
+            </w:r>
+          </w:p>
+        </w:tc>
+        <w:tc>
+          <w:tcPr>
+            <w:tcW w:type="dxa" w:w="720"/>
+          </w:tcPr>
+          <w:p>
+            <w:r/>
+            <w:r>
+              <w:rPr>
+                <w:sz w:val="17"/>
+              </w:rPr>
+              <w:t>OSS</w:t>
+            </w:r>
+          </w:p>
+        </w:tc>
+        <w:tc>
+          <w:tcPr>
+            <w:tcW w:type="dxa" w:w="1368"/>
+          </w:tcPr>
+          <w:p>
+            <w:r/>
+            <w:r>
+              <w:rPr>
+                <w:sz w:val="17"/>
+              </w:rPr>
+              <w:t>11/28</w:t>
+            </w:r>
+          </w:p>
+        </w:tc>
+        <w:tc>
+          <w:tcPr>
+            <w:tcW w:type="dxa" w:w="1224"/>
+          </w:tcPr>
+          <w:p>
+            <w:r/>
+            <w:r>
+              <w:rPr>
+                <w:sz w:val="17"/>
+              </w:rPr>
+              <w:t>39%</w:t>
+            </w:r>
+          </w:p>
+        </w:tc>
+        <w:tc>
+          <w:tcPr>
+            <w:tcW w:type="dxa" w:w="1368"/>
+          </w:tcPr>
+          <w:p>
+            <w:r/>
+            <w:r>
+              <w:rPr>
+                <w:sz w:val="17"/>
+              </w:rPr>
+              <w:t>17/22</w:t>
+            </w:r>
+          </w:p>
+        </w:tc>
+        <w:tc>
+          <w:tcPr>
+            <w:tcW w:type="dxa" w:w="1224"/>
+          </w:tcPr>
+          <w:p>
+            <w:r/>
+            <w:r>
+              <w:rPr>
+                <w:sz w:val="17"/>
+              </w:rPr>
+              <w:t>77%</w:t>
+            </w:r>
+          </w:p>
+        </w:tc>
+        <w:tc>
+          <w:tcPr>
+            <w:tcW w:type="dxa" w:w="1368"/>
+          </w:tcPr>
+          <w:p>
+            <w:r/>
+            <w:r>
+              <w:rPr>
+                <w:sz w:val="17"/>
+              </w:rPr>
+              <w:t>-38 pts</w:t>
+            </w:r>
+          </w:p>
+        </w:tc>
+      </w:tr>
+      <w:tr>
+        <w:tc>
+          <w:tcPr>
+            <w:tcW w:type="dxa" w:w="504"/>
+          </w:tcPr>
+          <w:p>
+            <w:r/>
+            <w:r>
+              <w:rPr>
+                <w:sz w:val="17"/>
+              </w:rPr>
+              <w:t>25</w:t>
+            </w:r>
+          </w:p>
+        </w:tc>
+        <w:tc>
+          <w:tcPr>
+            <w:tcW w:type="dxa" w:w="3312"/>
+          </w:tcPr>
+          <w:p>
+            <w:r/>
+            <w:r>
+              <w:rPr>
+                <w:sz w:val="17"/>
+              </w:rPr>
+              <w:t>qwen3.5_4b</w:t>
+            </w:r>
+          </w:p>
+        </w:tc>
+        <w:tc>
+          <w:tcPr>
+            <w:tcW w:type="dxa" w:w="720"/>
+          </w:tcPr>
+          <w:p>
+            <w:r/>
+            <w:r>
+              <w:rPr>
+                <w:sz w:val="17"/>
+              </w:rPr>
+              <w:t>OSS</w:t>
+            </w:r>
+          </w:p>
+        </w:tc>
+        <w:tc>
+          <w:tcPr>
+            <w:tcW w:type="dxa" w:w="1368"/>
+          </w:tcPr>
+          <w:p>
+            <w:r/>
+            <w:r>
+              <w:rPr>
+                <w:sz w:val="17"/>
+              </w:rPr>
+              <w:t>4/28</w:t>
+            </w:r>
+          </w:p>
+        </w:tc>
+        <w:tc>
+          <w:tcPr>
+            <w:tcW w:type="dxa" w:w="1224"/>
+          </w:tcPr>
+          <w:p>
+            <w:r/>
+            <w:r>
+              <w:rPr>
+                <w:sz w:val="17"/>
+              </w:rPr>
+              <w:t>14%</w:t>
+            </w:r>
+          </w:p>
+        </w:tc>
+        <w:tc>
+          <w:tcPr>
+            <w:tcW w:type="dxa" w:w="1368"/>
+          </w:tcPr>
+          <w:p>
+            <w:r/>
+            <w:r>
+              <w:rPr>
+                <w:sz w:val="17"/>
+              </w:rPr>
+              <w:t>17/22</w:t>
+            </w:r>
+          </w:p>
+        </w:tc>
+        <w:tc>
+          <w:tcPr>
+            <w:tcW w:type="dxa" w:w="1224"/>
+          </w:tcPr>
+          <w:p>
+            <w:r/>
+            <w:r>
+              <w:rPr>
+                <w:sz w:val="17"/>
+              </w:rPr>
+              <w:t>77%</w:t>
+            </w:r>
+          </w:p>
+        </w:tc>
+        <w:tc>
+          <w:tcPr>
+            <w:tcW w:type="dxa" w:w="1368"/>
+          </w:tcPr>
+          <w:p>
+            <w:r/>
+            <w:r>
+              <w:rPr>
+                <w:sz w:val="17"/>
+              </w:rPr>
+              <w:t>-63 pts</w:t>
+            </w:r>
+          </w:p>
+        </w:tc>
+      </w:tr>
+      <w:tr>
+        <w:tc>
+          <w:tcPr>
+            <w:tcW w:type="dxa" w:w="504"/>
+          </w:tcPr>
+          <w:p>
+            <w:r/>
+            <w:r>
+              <w:rPr>
+                <w:sz w:val="17"/>
+              </w:rPr>
+              <w:t>26</w:t>
             </w:r>
           </w:p>
         </w:tc>
@@ -4627,7 +7187,7 @@
         <w:rPr>
           <w:color w:val="0E7C6B"/>
         </w:rPr>
-        <w:t>4. How to read the interim board</w:t>
+        <w:t>4. How to read the board</w:t>
       </w:r>
     </w:p>
     <w:p>
@@ -4635,7 +7195,15 @@
         <w:pStyle w:val="ListBullet"/>
       </w:pPr>
       <w:r>
-        <w:t>The frontier is a statistical tie: gemini-3.5-flash (94%), claude-opus, claude-sonnet, and gemini-3.1-pro (92%) have fully overlapping intervals — at n=50 they are one tier, separated by cost and latency, not ability. claude-sonnet-4-6 is the efficiency frontier: 92% at 1.8 min/session.</w:t>
+        <w:t>The frontier is a statistical tie: qwen3-next-80b-thinking and gemini-3.5-flash (94%), then glm-5, claude-opus, claude-sonnet and gemini-3.1-pro (92%) — fully overlapping intervals; at n=50 they are one tier, separated by cost and latency, not ability. claude-sonnet-4-6 is the efficiency frontier: 92% at 1.8 min/session.</w:t>
+      </w:r>
+    </w:p>
+    <w:p>
+      <w:pPr>
+        <w:pStyle w:val="ListBullet"/>
+      </w:pPr>
+      <w:r>
+        <w:t>An OPEN model shares the lead: qwen3-next-80b-thinking (47/50). Thinking is not inherently fatal to the tool protocol — contrast deepseek-r1 (8%), whose reasoning budget starves the protocol. The grok family lands 82-90%, with the non-reasoning 4.1-fast variant (90%) beating both of its reasoning stablemates.</w:t>
       </w:r>
     </w:p>
     <w:p>
@@ -4667,7 +7235,7 @@
         <w:pStyle w:val="ListBullet"/>
       </w:pPr>
       <w:r>
-        <w:t>Zero infrastructure errors across all 16 completed legs — the extended retry ladder absorbed every transient. One operational incident: gemini-2.5-pro hung mid-call at ~75% on its first local attempt, was killed after a silent day, and is re-running on Colab; a log-freshness watchdog now catches hangs within 45 minutes.</w:t>
+        <w:t>Zero infrastructure errors across all 26 legs — the extended retry ladder absorbed every transient. One operational incident: gemini-2.5-pro hung mid-call at ~75% on its first local attempt, was killed after a silent day, and completed cleanly on Colab (43/50); a log-freshness watchdog now catches hangs within 45 minutes.</w:t>
       </w:r>
     </w:p>
     <w:p>

</xml_diff>